<commit_message>
Tighten PBCMT404 report layout
</commit_message>
<xml_diff>
--- a/report/Blood_Bank_PBCMT404_Report.docx
+++ b/report/Blood_Bank_PBCMT404_Report.docx
@@ -4,10 +4,8 @@
   <w:body>
     <w:p>
       <w:pPr>
-        <w:keepNext w:val="0"/>
-        <w:pageBreakBefore w:val="0"/>
         <w:widowControl/>
-        <w:spacing w:before="40" w:after="0" w:line="240" w:lineRule="auto"/>
+        <w:spacing w:before="0" w:after="0" w:line="240" w:lineRule="auto"/>
         <w:jc w:val="center"/>
       </w:pPr>
       <w:r>
@@ -23,10 +21,8 @@
     </w:p>
     <w:p>
       <w:pPr>
-        <w:keepNext w:val="0"/>
-        <w:pageBreakBefore w:val="0"/>
         <w:widowControl/>
-        <w:spacing w:before="0" w:after="360" w:line="240" w:lineRule="auto"/>
+        <w:spacing w:before="0" w:after="0" w:line="240" w:lineRule="auto"/>
         <w:jc w:val="center"/>
       </w:pPr>
       <w:r>
@@ -42,10 +38,8 @@
     </w:p>
     <w:p>
       <w:pPr>
-        <w:keepNext w:val="0"/>
-        <w:pageBreakBefore w:val="0"/>
         <w:widowControl/>
-        <w:spacing w:before="0" w:after="280" w:line="240" w:lineRule="auto"/>
+        <w:spacing w:before="280" w:after="0" w:line="240" w:lineRule="auto"/>
         <w:jc w:val="center"/>
       </w:pPr>
       <w:r>
@@ -61,10 +55,8 @@
     </w:p>
     <w:p>
       <w:pPr>
-        <w:keepNext w:val="0"/>
-        <w:pageBreakBefore w:val="0"/>
         <w:widowControl/>
-        <w:spacing w:before="0" w:after="280" w:line="240" w:lineRule="auto"/>
+        <w:spacing w:before="280" w:after="0" w:line="240" w:lineRule="auto"/>
         <w:jc w:val="center"/>
       </w:pPr>
       <w:r>
@@ -75,15 +67,13 @@
           <w:color w:val="17365D"/>
           <w:sz w:val="40"/>
         </w:rPr>
-        <w:t>Using Python, Flask and SQLite</w:t>
+        <w:t>Using Python and SQLite</w:t>
       </w:r>
     </w:p>
     <w:p>
       <w:pPr>
-        <w:keepNext w:val="0"/>
-        <w:pageBreakBefore w:val="0"/>
         <w:widowControl/>
-        <w:spacing w:before="0" w:after="280" w:line="240" w:lineRule="auto"/>
+        <w:spacing w:before="280" w:after="0" w:line="240" w:lineRule="auto"/>
         <w:jc w:val="center"/>
       </w:pPr>
       <w:r>
@@ -99,10 +89,8 @@
     </w:p>
     <w:p>
       <w:pPr>
-        <w:keepNext w:val="0"/>
-        <w:pageBreakBefore w:val="0"/>
         <w:widowControl/>
-        <w:spacing w:before="0" w:after="1080" w:line="240" w:lineRule="auto"/>
+        <w:spacing w:before="280" w:after="0" w:line="240" w:lineRule="auto"/>
         <w:jc w:val="center"/>
       </w:pPr>
       <w:r>
@@ -118,10 +106,13 @@
     </w:p>
     <w:p>
       <w:pPr>
-        <w:keepNext w:val="0"/>
-        <w:pageBreakBefore w:val="0"/>
+        <w:spacing w:before="0" w:after="1000" w:line="240" w:lineRule="auto"/>
+      </w:pPr>
+    </w:p>
+    <w:p>
+      <w:pPr>
         <w:widowControl/>
-        <w:spacing w:before="0" w:after="20" w:line="240" w:lineRule="auto"/>
+        <w:spacing w:before="0" w:after="0" w:line="240" w:lineRule="auto"/>
         <w:jc w:val="center"/>
       </w:pPr>
       <w:r>
@@ -137,8 +128,6 @@
     </w:p>
     <w:p>
       <w:pPr>
-        <w:keepNext w:val="0"/>
-        <w:pageBreakBefore w:val="0"/>
         <w:widowControl/>
         <w:spacing w:before="0" w:after="200" w:line="240" w:lineRule="auto"/>
         <w:jc w:val="center"/>
@@ -156,8 +145,6 @@
     </w:p>
     <w:p>
       <w:pPr>
-        <w:keepNext w:val="0"/>
-        <w:pageBreakBefore w:val="0"/>
         <w:widowControl/>
         <w:spacing w:before="0" w:after="360" w:line="240" w:lineRule="auto"/>
         <w:jc w:val="center"/>
@@ -175,8 +162,6 @@
     </w:p>
     <w:p>
       <w:pPr>
-        <w:keepNext w:val="0"/>
-        <w:pageBreakBefore w:val="0"/>
         <w:widowControl/>
         <w:spacing w:before="0" w:after="20" w:line="240" w:lineRule="auto"/>
         <w:jc w:val="center"/>
@@ -194,8 +179,6 @@
     </w:p>
     <w:p>
       <w:pPr>
-        <w:keepNext w:val="0"/>
-        <w:pageBreakBefore w:val="0"/>
         <w:widowControl/>
         <w:spacing w:before="0" w:after="0" w:line="240" w:lineRule="auto"/>
         <w:jc w:val="center"/>
@@ -213,8 +196,6 @@
     </w:p>
     <w:p>
       <w:pPr>
-        <w:keepNext w:val="0"/>
-        <w:pageBreakBefore w:val="0"/>
         <w:widowControl/>
         <w:spacing w:before="0" w:after="480" w:line="240" w:lineRule="auto"/>
         <w:jc w:val="center"/>
@@ -232,10 +213,8 @@
     </w:p>
     <w:p>
       <w:pPr>
-        <w:keepNext w:val="0"/>
-        <w:pageBreakBefore w:val="0"/>
         <w:widowControl/>
-        <w:spacing w:before="0" w:after="160" w:line="240" w:lineRule="auto"/>
+        <w:spacing w:before="0" w:after="200" w:line="240" w:lineRule="auto"/>
         <w:jc w:val="center"/>
       </w:pPr>
       <w:r>
@@ -295,302 +274,7 @@
                 <w:color w:val="000000"/>
                 <w:sz w:val="34"/>
               </w:rPr>
-              <w:t>[Student Name]</w:t>
-            </w:r>
-          </w:p>
-        </w:tc>
-        <w:tc>
-          <w:tcPr>
-            <w:tcW w:type="dxa" w:w="3888"/>
-            <w:tcMar>
-              <w:top w:w="0" w:type="dxa"/>
-              <w:left w:w="0" w:type="dxa"/>
-              <w:bottom w:w="0" w:type="dxa"/>
-              <w:right w:w="0" w:type="dxa"/>
-            </w:tcMar>
-          </w:tcPr>
-          <w:p>
-            <w:pPr>
-              <w:spacing w:after="0"/>
-              <w:jc w:val="right"/>
-            </w:pPr>
-            <w:r>
-              <w:rPr>
-                <w:rFonts w:ascii="Times New Roman" w:hAnsi="Times New Roman" w:cs="Times New Roman" w:eastAsia="Times New Roman"/>
-                <w:b w:val="0"/>
-                <w:i w:val="0"/>
-                <w:color w:val="000000"/>
-                <w:sz w:val="34"/>
-              </w:rPr>
-              <w:t>[Roll No.]</w:t>
-            </w:r>
-          </w:p>
-        </w:tc>
-      </w:tr>
-      <w:tr>
-        <w:trPr>
-          <w:trHeight w:val="634" w:hRule="atLeast"/>
-        </w:trPr>
-        <w:tc>
-          <w:tcPr>
-            <w:tcW w:type="dxa" w:w="5472"/>
-            <w:tcMar>
-              <w:top w:w="0" w:type="dxa"/>
-              <w:left w:w="0" w:type="dxa"/>
-              <w:bottom w:w="0" w:type="dxa"/>
-              <w:right w:w="0" w:type="dxa"/>
-            </w:tcMar>
-          </w:tcPr>
-          <w:p>
-            <w:pPr>
-              <w:spacing w:after="0"/>
-              <w:jc w:val="left"/>
-            </w:pPr>
-            <w:r>
-              <w:rPr>
-                <w:rFonts w:ascii="Times New Roman" w:hAnsi="Times New Roman" w:cs="Times New Roman" w:eastAsia="Times New Roman"/>
-                <w:b w:val="0"/>
-                <w:i w:val="0"/>
-                <w:color w:val="000000"/>
-                <w:sz w:val="34"/>
-              </w:rPr>
-              <w:t>[Student Name]</w:t>
-            </w:r>
-          </w:p>
-        </w:tc>
-        <w:tc>
-          <w:tcPr>
-            <w:tcW w:type="dxa" w:w="3888"/>
-            <w:tcMar>
-              <w:top w:w="0" w:type="dxa"/>
-              <w:left w:w="0" w:type="dxa"/>
-              <w:bottom w:w="0" w:type="dxa"/>
-              <w:right w:w="0" w:type="dxa"/>
-            </w:tcMar>
-          </w:tcPr>
-          <w:p>
-            <w:pPr>
-              <w:spacing w:after="0"/>
-              <w:jc w:val="right"/>
-            </w:pPr>
-            <w:r>
-              <w:rPr>
-                <w:rFonts w:ascii="Times New Roman" w:hAnsi="Times New Roman" w:cs="Times New Roman" w:eastAsia="Times New Roman"/>
-                <w:b w:val="0"/>
-                <w:i w:val="0"/>
-                <w:color w:val="000000"/>
-                <w:sz w:val="34"/>
-              </w:rPr>
-              <w:t>[Roll No.]</w:t>
-            </w:r>
-          </w:p>
-        </w:tc>
-      </w:tr>
-      <w:tr>
-        <w:trPr>
-          <w:trHeight w:val="634" w:hRule="atLeast"/>
-        </w:trPr>
-        <w:tc>
-          <w:tcPr>
-            <w:tcW w:type="dxa" w:w="5472"/>
-            <w:tcMar>
-              <w:top w:w="0" w:type="dxa"/>
-              <w:left w:w="0" w:type="dxa"/>
-              <w:bottom w:w="0" w:type="dxa"/>
-              <w:right w:w="0" w:type="dxa"/>
-            </w:tcMar>
-          </w:tcPr>
-          <w:p>
-            <w:pPr>
-              <w:spacing w:after="0"/>
-              <w:jc w:val="left"/>
-            </w:pPr>
-            <w:r>
-              <w:rPr>
-                <w:rFonts w:ascii="Times New Roman" w:hAnsi="Times New Roman" w:cs="Times New Roman" w:eastAsia="Times New Roman"/>
-                <w:b w:val="0"/>
-                <w:i w:val="0"/>
-                <w:color w:val="000000"/>
-                <w:sz w:val="34"/>
-              </w:rPr>
-              <w:t>[Student Name]</w:t>
-            </w:r>
-          </w:p>
-        </w:tc>
-        <w:tc>
-          <w:tcPr>
-            <w:tcW w:type="dxa" w:w="3888"/>
-            <w:tcMar>
-              <w:top w:w="0" w:type="dxa"/>
-              <w:left w:w="0" w:type="dxa"/>
-              <w:bottom w:w="0" w:type="dxa"/>
-              <w:right w:w="0" w:type="dxa"/>
-            </w:tcMar>
-          </w:tcPr>
-          <w:p>
-            <w:pPr>
-              <w:spacing w:after="0"/>
-              <w:jc w:val="right"/>
-            </w:pPr>
-            <w:r>
-              <w:rPr>
-                <w:rFonts w:ascii="Times New Roman" w:hAnsi="Times New Roman" w:cs="Times New Roman" w:eastAsia="Times New Roman"/>
-                <w:b w:val="0"/>
-                <w:i w:val="0"/>
-                <w:color w:val="000000"/>
-                <w:sz w:val="34"/>
-              </w:rPr>
-              <w:t>[Roll No.]</w:t>
-            </w:r>
-          </w:p>
-        </w:tc>
-      </w:tr>
-      <w:tr>
-        <w:trPr>
-          <w:trHeight w:val="634" w:hRule="atLeast"/>
-        </w:trPr>
-        <w:tc>
-          <w:tcPr>
-            <w:tcW w:type="dxa" w:w="5472"/>
-            <w:tcMar>
-              <w:top w:w="0" w:type="dxa"/>
-              <w:left w:w="0" w:type="dxa"/>
-              <w:bottom w:w="0" w:type="dxa"/>
-              <w:right w:w="0" w:type="dxa"/>
-            </w:tcMar>
-          </w:tcPr>
-          <w:p>
-            <w:pPr>
-              <w:spacing w:after="0"/>
-              <w:jc w:val="left"/>
-            </w:pPr>
-            <w:r>
-              <w:rPr>
-                <w:rFonts w:ascii="Times New Roman" w:hAnsi="Times New Roman" w:cs="Times New Roman" w:eastAsia="Times New Roman"/>
-                <w:b w:val="0"/>
-                <w:i w:val="0"/>
-                <w:color w:val="000000"/>
-                <w:sz w:val="34"/>
-              </w:rPr>
-              <w:t>[Student Name]</w:t>
-            </w:r>
-          </w:p>
-        </w:tc>
-        <w:tc>
-          <w:tcPr>
-            <w:tcW w:type="dxa" w:w="3888"/>
-            <w:tcMar>
-              <w:top w:w="0" w:type="dxa"/>
-              <w:left w:w="0" w:type="dxa"/>
-              <w:bottom w:w="0" w:type="dxa"/>
-              <w:right w:w="0" w:type="dxa"/>
-            </w:tcMar>
-          </w:tcPr>
-          <w:p>
-            <w:pPr>
-              <w:spacing w:after="0"/>
-              <w:jc w:val="right"/>
-            </w:pPr>
-            <w:r>
-              <w:rPr>
-                <w:rFonts w:ascii="Times New Roman" w:hAnsi="Times New Roman" w:cs="Times New Roman" w:eastAsia="Times New Roman"/>
-                <w:b w:val="0"/>
-                <w:i w:val="0"/>
-                <w:color w:val="000000"/>
-                <w:sz w:val="34"/>
-              </w:rPr>
-              <w:t>[Roll No.]</w:t>
-            </w:r>
-          </w:p>
-        </w:tc>
-      </w:tr>
-      <w:tr>
-        <w:trPr>
-          <w:trHeight w:val="634" w:hRule="atLeast"/>
-        </w:trPr>
-        <w:tc>
-          <w:tcPr>
-            <w:tcW w:type="dxa" w:w="5472"/>
-            <w:tcMar>
-              <w:top w:w="0" w:type="dxa"/>
-              <w:left w:w="0" w:type="dxa"/>
-              <w:bottom w:w="0" w:type="dxa"/>
-              <w:right w:w="0" w:type="dxa"/>
-            </w:tcMar>
-          </w:tcPr>
-          <w:p>
-            <w:pPr>
-              <w:spacing w:after="0"/>
-              <w:jc w:val="left"/>
-            </w:pPr>
-            <w:r>
-              <w:rPr>
-                <w:rFonts w:ascii="Times New Roman" w:hAnsi="Times New Roman" w:cs="Times New Roman" w:eastAsia="Times New Roman"/>
-                <w:b w:val="0"/>
-                <w:i w:val="0"/>
-                <w:color w:val="000000"/>
-                <w:sz w:val="34"/>
-              </w:rPr>
-              <w:t>[Student Name]</w:t>
-            </w:r>
-          </w:p>
-        </w:tc>
-        <w:tc>
-          <w:tcPr>
-            <w:tcW w:type="dxa" w:w="3888"/>
-            <w:tcMar>
-              <w:top w:w="0" w:type="dxa"/>
-              <w:left w:w="0" w:type="dxa"/>
-              <w:bottom w:w="0" w:type="dxa"/>
-              <w:right w:w="0" w:type="dxa"/>
-            </w:tcMar>
-          </w:tcPr>
-          <w:p>
-            <w:pPr>
-              <w:spacing w:after="0"/>
-              <w:jc w:val="right"/>
-            </w:pPr>
-            <w:r>
-              <w:rPr>
-                <w:rFonts w:ascii="Times New Roman" w:hAnsi="Times New Roman" w:cs="Times New Roman" w:eastAsia="Times New Roman"/>
-                <w:b w:val="0"/>
-                <w:i w:val="0"/>
-                <w:color w:val="000000"/>
-                <w:sz w:val="34"/>
-              </w:rPr>
-              <w:t>[Roll No.]</w:t>
-            </w:r>
-          </w:p>
-        </w:tc>
-      </w:tr>
-      <w:tr>
-        <w:trPr>
-          <w:trHeight w:val="634" w:hRule="atLeast"/>
-        </w:trPr>
-        <w:tc>
-          <w:tcPr>
-            <w:tcW w:type="dxa" w:w="5472"/>
-            <w:tcMar>
-              <w:top w:w="0" w:type="dxa"/>
-              <w:left w:w="0" w:type="dxa"/>
-              <w:bottom w:w="0" w:type="dxa"/>
-              <w:right w:w="0" w:type="dxa"/>
-            </w:tcMar>
-          </w:tcPr>
-          <w:p>
-            <w:pPr>
-              <w:spacing w:after="0"/>
-              <w:jc w:val="left"/>
-            </w:pPr>
-            <w:r>
-              <w:rPr>
-                <w:rFonts w:ascii="Times New Roman" w:hAnsi="Times New Roman" w:cs="Times New Roman" w:eastAsia="Times New Roman"/>
-                <w:b w:val="0"/>
-                <w:i w:val="0"/>
-                <w:color w:val="000000"/>
-                <w:sz w:val="34"/>
-              </w:rPr>
-              <w:t>[Student Name]</w:t>
+              <w:t>ADITHYA</w:t>
             </w:r>
           </w:p>
         </w:tc>
@@ -627,7 +311,7 @@
       <w:pPr>
         <w:sectPr>
           <w:pgSz w:w="12240" w:h="15840"/>
-          <w:pgMar w:top="720" w:right="1440" w:bottom="720" w:left="1440" w:header="360" w:footer="403" w:gutter="0"/>
+          <w:pgMar w:top="720" w:right="1440" w:bottom="720" w:left="1440" w:header="360" w:footer="360" w:gutter="0"/>
           <w:cols w:space="720"/>
           <w:docGrid w:linePitch="360"/>
         </w:sectPr>
@@ -635,8 +319,6 @@
     </w:p>
     <w:p>
       <w:pPr>
-        <w:keepNext w:val="0"/>
-        <w:pageBreakBefore w:val="0"/>
         <w:widowControl/>
         <w:spacing w:before="0" w:after="600" w:line="240" w:lineRule="auto"/>
         <w:jc w:val="center"/>
@@ -1011,7 +693,7 @@
                 <w:color w:val="000000"/>
                 <w:sz w:val="24"/>
               </w:rPr>
-              <w:t>5-10</w:t>
+              <w:t>5-9</w:t>
             </w:r>
           </w:p>
         </w:tc>
@@ -1097,7 +779,7 @@
                 <w:color w:val="000000"/>
                 <w:sz w:val="24"/>
               </w:rPr>
-              <w:t>11-18</w:t>
+              <w:t>10-17</w:t>
             </w:r>
           </w:p>
         </w:tc>
@@ -1183,7 +865,7 @@
                 <w:color w:val="000000"/>
                 <w:sz w:val="24"/>
               </w:rPr>
-              <w:t>19</w:t>
+              <w:t>18</w:t>
             </w:r>
           </w:p>
         </w:tc>
@@ -1191,38 +873,10 @@
     </w:tbl>
     <w:p>
       <w:pPr>
-        <w:keepNext w:val="0"/>
-        <w:pageBreakBefore w:val="0"/>
-        <w:widowControl/>
-        <w:spacing w:before="0" w:after="0" w:line="276" w:lineRule="auto"/>
-        <w:jc w:val="both"/>
-      </w:pPr>
-    </w:p>
-    <w:p>
-      <w:pPr>
-        <w:keepNext w:val="0"/>
-        <w:pageBreakBefore w:val="0"/>
-        <w:widowControl/>
-        <w:spacing w:before="480" w:after="0" w:line="276" w:lineRule="auto"/>
-        <w:jc w:val="center"/>
-      </w:pPr>
-      <w:r>
-        <w:rPr>
-          <w:rFonts w:ascii="Times New Roman" w:hAnsi="Times New Roman" w:cs="Times New Roman" w:eastAsia="Times New Roman"/>
-          <w:b w:val="0"/>
-          <w:i/>
-          <w:color w:val="55594F"/>
-          <w:sz w:val="21"/>
-        </w:rPr>
-        <w:t>This report describes the submitted academic prototype. All names, hospitals, stock counts and requests are synthetic demonstration data.</w:t>
-      </w:r>
-    </w:p>
-    <w:p>
-      <w:pPr>
         <w:sectPr>
           <w:footerReference w:type="default" r:id="rId9"/>
           <w:pgSz w:w="12240" w:h="15840"/>
-          <w:pgMar w:top="720" w:right="1440" w:bottom="720" w:left="1440" w:header="360" w:footer="403" w:gutter="0"/>
+          <w:pgMar w:top="720" w:right="1440" w:bottom="720" w:left="1440" w:header="360" w:footer="360" w:gutter="0"/>
           <w:cols w:space="720"/>
           <w:docGrid w:linePitch="360"/>
         </w:sectPr>
@@ -1230,8 +884,11 @@
     </w:p>
     <w:p>
       <w:pPr>
-        <w:keepNext/>
-        <w:pageBreakBefore w:val="0"/>
+        <w:spacing w:before="0" w:after="200" w:line="240" w:lineRule="auto"/>
+      </w:pPr>
+    </w:p>
+    <w:p>
+      <w:pPr>
         <w:widowControl/>
         <w:spacing w:before="0" w:after="0" w:line="240" w:lineRule="auto"/>
         <w:jc w:val="center"/>
@@ -1249,10 +906,8 @@
     </w:p>
     <w:p>
       <w:pPr>
-        <w:keepNext/>
-        <w:pageBreakBefore w:val="0"/>
         <w:widowControl/>
-        <w:spacing w:before="0" w:after="360" w:line="240" w:lineRule="auto"/>
+        <w:spacing w:before="0" w:after="320" w:line="240" w:lineRule="auto"/>
         <w:jc w:val="center"/>
       </w:pPr>
       <w:r>
@@ -1268,10 +923,8 @@
     </w:p>
     <w:p>
       <w:pPr>
-        <w:keepNext w:val="0"/>
-        <w:pageBreakBefore w:val="0"/>
         <w:widowControl/>
-        <w:spacing w:before="0" w:after="200" w:line="276" w:lineRule="auto"/>
+        <w:spacing w:before="0" w:after="0" w:line="276" w:lineRule="auto"/>
         <w:jc w:val="both"/>
       </w:pPr>
       <w:r>
@@ -1282,15 +935,13 @@
           <w:color w:val="000000"/>
           <w:sz w:val="24"/>
         </w:rPr>
-        <w:t>The Online Blood Bank and Donor Management System (OBBDMS) is a database-driven web application designed to manage donor records, hospital blood stock, requests, donations and donation appointments. In a traditional blood bank, these records are often maintained in registers, spreadsheets and separate hospital systems. Staff must reconcile donor details, available units, pending requests and donation history before they can answer a simple question: does a hospital currently have usable units of a given blood group?</w:t>
+        <w:t>The Online Blood Bank and Donor Management System (OBBDMS) is a database-driven web application designed to manage donor records, hospital blood stock, blood requests, donation records and donation appointments. In a traditional blood bank, these records are often maintained in paper registers, spreadsheets and disconnected hospital systems. Staff must reconcile donor details, available units, pending requests and donation history before they can answer a simple question: does a hospital currently hold usable units of a given blood group?</w:t>
       </w:r>
     </w:p>
     <w:p>
       <w:pPr>
-        <w:keepNext w:val="0"/>
-        <w:pageBreakBefore w:val="0"/>
         <w:widowControl/>
-        <w:spacing w:before="0" w:after="200" w:line="276" w:lineRule="auto"/>
+        <w:spacing w:before="0" w:after="0" w:line="276" w:lineRule="auto"/>
         <w:jc w:val="both"/>
       </w:pPr>
       <w:r>
@@ -1301,15 +952,13 @@
           <w:color w:val="000000"/>
           <w:sz w:val="24"/>
         </w:rPr>
-        <w:t>That fragmentation creates duplicate records, inconsistent stock counts and requests whose status is known only to the person who received a phone call. A donor may also have no reliable way to check when they last donated or when they are next eligible. The project addresses these problems by bringing the core records into one relational database and giving each user a focused interface for the work they need to perform.</w:t>
+        <w:t>That manual approach creates duplicated records, stale stock counts and requests whose status is known only to the person who received the phone call. Donors likewise have no reliable way to check when they last donated or when they become eligible to donate again. The project addresses these problems by centralising the core data in one relational database and giving each role a focused interface for the work it needs to perform.</w:t>
       </w:r>
     </w:p>
     <w:p>
       <w:pPr>
-        <w:keepNext w:val="0"/>
-        <w:pageBreakBefore w:val="0"/>
         <w:widowControl/>
-        <w:spacing w:before="0" w:after="200" w:line="276" w:lineRule="auto"/>
+        <w:spacing w:before="0" w:after="0" w:line="276" w:lineRule="auto"/>
         <w:jc w:val="both"/>
       </w:pPr>
       <w:r>
@@ -1320,15 +969,13 @@
           <w:color w:val="000000"/>
           <w:sz w:val="24"/>
         </w:rPr>
-        <w:t>The system is implemented using Python 3.10, Flask 3.1 and SQLite. Flask provides the application layer and route-level access control; Jinja templates and a custom CSS interface provide the presentation layer; SQLite stores the relational data. Two roles are supported. Donors register, sign in, check eligibility, book a donation slot, search for blood and raise requests. Administrators manage hospitals, inventory, requests, donations and donor records from a dispatch-board interface.</w:t>
+        <w:t>The system is implemented using Python 3.10, Flask 3.1 and SQLite. Flask provides the application layer and route-level access control, Jinja templates and a custom CSS interface provide the presentation layer, and SQLite stores the relational data. Two roles are supported. Donors register, sign in, check their 90-day eligibility, book a donation slot, search for blood and raise requests. Administrators manage hospitals, inventory, requests, donations and donor records from a dispatch-board interface.</w:t>
       </w:r>
     </w:p>
     <w:p>
       <w:pPr>
-        <w:keepNext w:val="0"/>
-        <w:pageBreakBefore w:val="0"/>
         <w:widowControl/>
-        <w:spacing w:before="0" w:after="200" w:line="276" w:lineRule="auto"/>
+        <w:spacing w:before="0" w:after="0" w:line="276" w:lineRule="auto"/>
         <w:jc w:val="both"/>
       </w:pPr>
       <w:r>
@@ -1339,15 +986,13 @@
           <w:color w:val="000000"/>
           <w:sz w:val="24"/>
         </w:rPr>
-        <w:t>From a database-systems perspective, the project demonstrates relational schema design, primary and foreign keys, uniqueness constraints, check constraints, indexes and multi-table joins. The schema contains six related tables: users, hospitals, inventory, requests, donations and appointments. Inventory is unique per hospital and blood group; requests and donations reference both a user and a hospital; appointments reference a donor and a hospital. These constraints keep the data consistent when records are inserted or updated through the application.</w:t>
+        <w:t>From a database-systems perspective, the project applies relational schema design, primary and foreign keys, uniqueness constraints, check constraints, indexes and parameterized SQL. The schema contains six related tables: users, hospitals, inventory, requests, donations and appointments. Inventory is unique per hospital and blood group, requests and donations reference both a user and a hospital, and appointments reference a donor and a hospital. These constraints keep the data consistent when records are inserted or updated through the application.</w:t>
       </w:r>
     </w:p>
     <w:p>
       <w:pPr>
-        <w:keepNext w:val="0"/>
-        <w:pageBreakBefore w:val="0"/>
         <w:widowControl/>
-        <w:spacing w:before="0" w:after="200" w:line="276" w:lineRule="auto"/>
+        <w:spacing w:before="0" w:after="0" w:line="276" w:lineRule="auto"/>
         <w:jc w:val="both"/>
       </w:pPr>
       <w:r>
@@ -1358,15 +1003,13 @@
           <w:color w:val="000000"/>
           <w:sz w:val="24"/>
         </w:rPr>
-        <w:t>The primary objectives of the project are to centralise donor and stock data, provide public availability search, calculate donor eligibility from donation history, enforce a controlled request lifecycle, protect state-changing operations with authentication and CSRF tokens, and present the same relational data through a usable desktop and mobile interface. The system is deliberately scoped as an academic prototype. It does not verify clinical compatibility, screen blood, confirm donor identity or replace hospital procedures.</w:t>
+        <w:t>The primary objectives of the project are to centralise donor and stock data, provide public availability search, compute donor eligibility from donation history, enforce a controlled request lifecycle, protect state-changing operations with authentication and CSRF tokens, and render the same relational data through a usable desktop and mobile interface. The system is deliberately scoped as an academic prototype with synthetic data; it does not verify clinical compatibility, screen blood or replace hospital procedures.</w:t>
       </w:r>
     </w:p>
     <w:p>
       <w:pPr>
-        <w:keepNext w:val="0"/>
-        <w:pageBreakBefore w:val="0"/>
         <w:widowControl/>
-        <w:spacing w:before="0" w:after="200" w:line="276" w:lineRule="auto"/>
+        <w:spacing w:before="0" w:after="0" w:line="276" w:lineRule="auto"/>
         <w:jc w:val="both"/>
       </w:pPr>
       <w:r>
@@ -1377,13 +1020,21 @@
           <w:color w:val="000000"/>
           <w:sz w:val="24"/>
         </w:rPr>
-        <w:t>The remainder of this report follows the PBCMT404 mini-project structure. Chapter 2 explains the requirement analysis, system design, architecture and tools. Chapter 3 presents the database schema and implementation modules. Chapter 4 shows the working interface and the results of the implemented workflows. Chapter 5 concludes the report and identifies the limitations of the prototype.</w:t>
+        <w:t>The report follows the PBCMT404 mini-project structure. Chapter 2 explains the requirement analysis, system design, architecture and tools. Chapter 3 presents the database schema and the implementation modules. Chapter 4 shows the working interface and the results of the exercised workflows. Chapter 5 concludes the report and identifies the limitations of the prototype.</w:t>
       </w:r>
     </w:p>
     <w:p>
-      <w:pPr>
-        <w:keepNext/>
-        <w:pageBreakBefore/>
+      <w:r>
+        <w:br w:type="page"/>
+      </w:r>
+    </w:p>
+    <w:p>
+      <w:pPr>
+        <w:spacing w:before="0" w:after="200" w:line="240" w:lineRule="auto"/>
+      </w:pPr>
+    </w:p>
+    <w:p>
+      <w:pPr>
         <w:widowControl/>
         <w:spacing w:before="0" w:after="0" w:line="240" w:lineRule="auto"/>
         <w:jc w:val="center"/>
@@ -1401,10 +1052,8 @@
     </w:p>
     <w:p>
       <w:pPr>
-        <w:keepNext/>
-        <w:pageBreakBefore w:val="0"/>
         <w:widowControl/>
-        <w:spacing w:before="0" w:after="360" w:line="240" w:lineRule="auto"/>
+        <w:spacing w:before="0" w:after="320" w:line="240" w:lineRule="auto"/>
         <w:jc w:val="center"/>
       </w:pPr>
       <w:r>
@@ -1420,10 +1069,9 @@
     </w:p>
     <w:p>
       <w:pPr>
-        <w:keepNext/>
         <w:pageBreakBefore w:val="0"/>
         <w:widowControl/>
-        <w:spacing w:before="240" w:after="140" w:line="240" w:lineRule="auto"/>
+        <w:spacing w:before="200" w:after="120" w:line="240" w:lineRule="auto"/>
         <w:jc w:val="left"/>
       </w:pPr>
       <w:r>
@@ -1439,10 +1087,8 @@
     </w:p>
     <w:p>
       <w:pPr>
-        <w:keepNext w:val="0"/>
-        <w:pageBreakBefore w:val="0"/>
         <w:widowControl/>
-        <w:spacing w:before="0" w:after="200" w:line="276" w:lineRule="auto"/>
+        <w:spacing w:before="0" w:after="0" w:line="276" w:lineRule="auto"/>
         <w:jc w:val="both"/>
       </w:pPr>
       <w:r>
@@ -1453,13 +1099,13 @@
           <w:color w:val="000000"/>
           <w:sz w:val="24"/>
         </w:rPr>
-        <w:t>The requirements were derived from the daily work of a small blood bank: registering donors, checking stock, responding to hospital requests, recording donations and helping donors understand their eligibility. The following functional requirements were identified:</w:t>
+        <w:t>The requirements were identified from the daily work of a small blood bank. The following functional requirements shaped the design:</w:t>
       </w:r>
     </w:p>
     <w:p>
       <w:pPr>
         <w:pStyle w:val="ListBullet"/>
-        <w:spacing w:before="0" w:after="100" w:line="276" w:lineRule="auto"/>
+        <w:spacing w:before="0" w:after="0" w:line="276" w:lineRule="auto"/>
         <w:ind w:left="432" w:hanging="259"/>
         <w:jc w:val="left"/>
       </w:pPr>
@@ -1471,13 +1117,13 @@
           <w:color w:val="000000"/>
           <w:sz w:val="24"/>
         </w:rPr>
-        <w:t>Public availability search by blood group and city, without requiring a login.</w:t>
+        <w:t>Public availability search by blood group and city without requiring a login.</w:t>
       </w:r>
     </w:p>
     <w:p>
       <w:pPr>
         <w:pStyle w:val="ListBullet"/>
-        <w:spacing w:before="0" w:after="100" w:line="276" w:lineRule="auto"/>
+        <w:spacing w:before="0" w:after="0" w:line="276" w:lineRule="auto"/>
         <w:ind w:left="432" w:hanging="259"/>
         <w:jc w:val="left"/>
       </w:pPr>
@@ -1495,7 +1141,7 @@
     <w:p>
       <w:pPr>
         <w:pStyle w:val="ListBullet"/>
-        <w:spacing w:before="0" w:after="100" w:line="276" w:lineRule="auto"/>
+        <w:spacing w:before="0" w:after="0" w:line="276" w:lineRule="auto"/>
         <w:ind w:left="432" w:hanging="259"/>
         <w:jc w:val="left"/>
       </w:pPr>
@@ -1513,7 +1159,7 @@
     <w:p>
       <w:pPr>
         <w:pStyle w:val="ListBullet"/>
-        <w:spacing w:before="0" w:after="100" w:line="276" w:lineRule="auto"/>
+        <w:spacing w:before="0" w:after="0" w:line="276" w:lineRule="auto"/>
         <w:ind w:left="432" w:hanging="259"/>
         <w:jc w:val="left"/>
       </w:pPr>
@@ -1531,7 +1177,7 @@
     <w:p>
       <w:pPr>
         <w:pStyle w:val="ListBullet"/>
-        <w:spacing w:before="0" w:after="100" w:line="276" w:lineRule="auto"/>
+        <w:spacing w:before="0" w:after="0" w:line="276" w:lineRule="auto"/>
         <w:ind w:left="432" w:hanging="259"/>
         <w:jc w:val="left"/>
       </w:pPr>
@@ -1543,13 +1189,13 @@
           <w:color w:val="000000"/>
           <w:sz w:val="24"/>
         </w:rPr>
-        <w:t>Hospital and inventory management, including one stock line per hospital and blood group.</w:t>
+        <w:t>Hospital and inventory management with one stock line per hospital and blood group.</w:t>
       </w:r>
     </w:p>
     <w:p>
       <w:pPr>
         <w:pStyle w:val="ListBullet"/>
-        <w:spacing w:before="0" w:after="100" w:line="276" w:lineRule="auto"/>
+        <w:spacing w:before="0" w:after="0" w:line="276" w:lineRule="auto"/>
         <w:ind w:left="432" w:hanging="259"/>
         <w:jc w:val="left"/>
       </w:pPr>
@@ -1567,7 +1213,7 @@
     <w:p>
       <w:pPr>
         <w:pStyle w:val="ListBullet"/>
-        <w:spacing w:before="0" w:after="100" w:line="276" w:lineRule="auto"/>
+        <w:spacing w:before="0" w:after="0" w:line="276" w:lineRule="auto"/>
         <w:ind w:left="432" w:hanging="259"/>
         <w:jc w:val="left"/>
       </w:pPr>
@@ -1579,13 +1225,13 @@
           <w:color w:val="000000"/>
           <w:sz w:val="24"/>
         </w:rPr>
-        <w:t>Donation logging and donor record management.</w:t>
+        <w:t>Donation logging, hospital management and donor record search.</w:t>
       </w:r>
     </w:p>
     <w:p>
       <w:pPr>
         <w:pStyle w:val="ListBullet"/>
-        <w:spacing w:before="0" w:after="100" w:line="276" w:lineRule="auto"/>
+        <w:spacing w:before="0" w:after="0" w:line="276" w:lineRule="auto"/>
         <w:ind w:left="432" w:hanging="259"/>
         <w:jc w:val="left"/>
       </w:pPr>
@@ -1597,15 +1243,14 @@
           <w:color w:val="000000"/>
           <w:sz w:val="24"/>
         </w:rPr>
-        <w:t>Role-based access control, CSRF protection and server-side validation for every state-changing operation.</w:t>
+        <w:t>Role-based access control, CSRF protection and server-side validation on every write.</w:t>
       </w:r>
     </w:p>
     <w:p>
       <w:pPr>
-        <w:keepNext/>
         <w:pageBreakBefore w:val="0"/>
         <w:widowControl/>
-        <w:spacing w:before="240" w:after="140" w:line="240" w:lineRule="auto"/>
+        <w:spacing w:before="200" w:after="120" w:line="240" w:lineRule="auto"/>
         <w:jc w:val="left"/>
       </w:pPr>
       <w:r>
@@ -1621,10 +1266,8 @@
     </w:p>
     <w:p>
       <w:pPr>
-        <w:keepNext w:val="0"/>
-        <w:pageBreakBefore w:val="0"/>
         <w:widowControl/>
-        <w:spacing w:before="0" w:after="200" w:line="276" w:lineRule="auto"/>
+        <w:spacing w:before="0" w:after="0" w:line="276" w:lineRule="auto"/>
         <w:jc w:val="both"/>
       </w:pPr>
       <w:r>
@@ -1635,13 +1278,13 @@
           <w:color w:val="000000"/>
           <w:sz w:val="24"/>
         </w:rPr>
-        <w:t>The design follows an entity-relationship model. The main entities and relationships are:</w:t>
+        <w:t>The design follows an entity-relationship model. The entities and relationships are:</w:t>
       </w:r>
     </w:p>
     <w:p>
       <w:pPr>
         <w:pStyle w:val="ListBullet"/>
-        <w:spacing w:before="0" w:after="100" w:line="276" w:lineRule="auto"/>
+        <w:spacing w:before="0" w:after="0" w:line="276" w:lineRule="auto"/>
         <w:ind w:left="432" w:hanging="259"/>
         <w:jc w:val="left"/>
       </w:pPr>
@@ -1653,13 +1296,13 @@
           <w:color w:val="000000"/>
           <w:sz w:val="24"/>
         </w:rPr>
-        <w:t>Users: donors and administrators. Each user has a unique email and a role constrained to donor or admin.</w:t>
+        <w:t>users: donors and administrators, with a unique email and a role constrained to donor or admin.</w:t>
       </w:r>
     </w:p>
     <w:p>
       <w:pPr>
         <w:pStyle w:val="ListBullet"/>
-        <w:spacing w:before="0" w:after="100" w:line="276" w:lineRule="auto"/>
+        <w:spacing w:before="0" w:after="0" w:line="276" w:lineRule="auto"/>
         <w:ind w:left="432" w:hanging="259"/>
         <w:jc w:val="left"/>
       </w:pPr>
@@ -1671,13 +1314,13 @@
           <w:color w:val="000000"/>
           <w:sz w:val="24"/>
         </w:rPr>
-        <w:t>Hospitals: blood-bank sites with a name, city, phone number and address.</w:t>
+        <w:t>hospitals: blood-bank sites with name, city, phone and address.</w:t>
       </w:r>
     </w:p>
     <w:p>
       <w:pPr>
         <w:pStyle w:val="ListBullet"/>
-        <w:spacing w:before="0" w:after="100" w:line="276" w:lineRule="auto"/>
+        <w:spacing w:before="0" w:after="0" w:line="276" w:lineRule="auto"/>
         <w:ind w:left="432" w:hanging="259"/>
         <w:jc w:val="left"/>
       </w:pPr>
@@ -1689,13 +1332,13 @@
           <w:color w:val="000000"/>
           <w:sz w:val="24"/>
         </w:rPr>
-        <w:t>Inventory: one row per hospital and blood group, with a non-negative unit count. The pair (hospital_id, blood_group) is unique.</w:t>
+        <w:t>inventory: one row per hospital and blood group, with a non-negative unit count and a UNIQUE pair (hospital_id, blood_group).</w:t>
       </w:r>
     </w:p>
     <w:p>
       <w:pPr>
         <w:pStyle w:val="ListBullet"/>
-        <w:spacing w:before="0" w:after="100" w:line="276" w:lineRule="auto"/>
+        <w:spacing w:before="0" w:after="0" w:line="276" w:lineRule="auto"/>
         <w:ind w:left="432" w:hanging="259"/>
         <w:jc w:val="left"/>
       </w:pPr>
@@ -1707,13 +1350,13 @@
           <w:color w:val="000000"/>
           <w:sz w:val="24"/>
         </w:rPr>
-        <w:t>Requests: a blood request raised by a user for a hospital, blood group, unit count, urgency and status.</w:t>
+        <w:t>requests: raised by a user for a hospital, blood group, unit count, urgency and status.</w:t>
       </w:r>
     </w:p>
     <w:p>
       <w:pPr>
         <w:pStyle w:val="ListBullet"/>
-        <w:spacing w:before="0" w:after="100" w:line="276" w:lineRule="auto"/>
+        <w:spacing w:before="0" w:after="0" w:line="276" w:lineRule="auto"/>
         <w:ind w:left="432" w:hanging="259"/>
         <w:jc w:val="left"/>
       </w:pPr>
@@ -1725,13 +1368,13 @@
           <w:color w:val="000000"/>
           <w:sz w:val="24"/>
         </w:rPr>
-        <w:t>Donations: a completed donation by a donor at a hospital, used to calculate eligibility and history.</w:t>
+        <w:t>donations: completed donations by a donor at a hospital, used for history and eligibility.</w:t>
       </w:r>
     </w:p>
     <w:p>
       <w:pPr>
         <w:pStyle w:val="ListBullet"/>
-        <w:spacing w:before="0" w:after="100" w:line="276" w:lineRule="auto"/>
+        <w:spacing w:before="0" w:after="0" w:line="276" w:lineRule="auto"/>
         <w:ind w:left="432" w:hanging="259"/>
         <w:jc w:val="left"/>
       </w:pPr>
@@ -1743,15 +1386,13 @@
           <w:color w:val="000000"/>
           <w:sz w:val="24"/>
         </w:rPr>
-        <w:t>Appointments: a booked donation slot for a donor at a hospital, with a date, time and status.</w:t>
+        <w:t>appointments: booked donation slots for a donor at a hospital, with date, time and status.</w:t>
       </w:r>
     </w:p>
     <w:p>
       <w:pPr>
-        <w:keepNext w:val="0"/>
-        <w:pageBreakBefore w:val="0"/>
         <w:widowControl/>
-        <w:spacing w:before="0" w:after="200" w:line="276" w:lineRule="auto"/>
+        <w:spacing w:before="0" w:after="0" w:line="276" w:lineRule="auto"/>
         <w:jc w:val="both"/>
       </w:pPr>
       <w:r>
@@ -1762,7 +1403,7 @@
           <w:color w:val="000000"/>
           <w:sz w:val="24"/>
         </w:rPr>
-        <w:t>A user can raise many requests and make many donations. A hospital can hold many inventory lines, receive many requests and record many donations. A donor can book many appointments over time. These one-to-many relationships are enforced with foreign keys, and SQLite foreign-key enforcement is enabled for every connection.</w:t>
+        <w:t>A user can raise many requests, make many donations and book many appointments. A hospital can hold many inventory lines, receive many requests and record many donations. Each of these one-to-many relationships is enforced with a foreign key, and SQLite foreign-key enforcement is enabled on every connection.</w:t>
       </w:r>
     </w:p>
     <w:p>
@@ -1774,7 +1415,7 @@
       <w:r>
         <w:drawing>
           <wp:inline xmlns:a="http://schemas.openxmlformats.org/drawingml/2006/main" xmlns:pic="http://schemas.openxmlformats.org/drawingml/2006/picture">
-            <wp:extent cx="5715000" cy="3703562"/>
+            <wp:extent cx="5532120" cy="3585048"/>
             <wp:docPr id="1" name="Picture 1"/>
             <wp:cNvGraphicFramePr>
               <a:graphicFrameLocks noChangeAspect="1"/>
@@ -1795,7 +1436,7 @@
                   <pic:spPr>
                     <a:xfrm>
                       <a:off x="0" y="0"/>
-                      <a:ext cx="5715000" cy="3703562"/>
+                      <a:ext cx="5532120" cy="3585048"/>
                     </a:xfrm>
                     <a:prstGeom prst="rect"/>
                   </pic:spPr>
@@ -1808,8 +1449,6 @@
     </w:p>
     <w:p>
       <w:pPr>
-        <w:keepNext w:val="0"/>
-        <w:pageBreakBefore w:val="0"/>
         <w:widowControl/>
         <w:spacing w:before="0" w:after="160" w:line="240" w:lineRule="auto"/>
         <w:jc w:val="center"/>
@@ -1827,10 +1466,9 @@
     </w:p>
     <w:p>
       <w:pPr>
-        <w:keepNext/>
         <w:pageBreakBefore w:val="0"/>
         <w:widowControl/>
-        <w:spacing w:before="240" w:after="140" w:line="240" w:lineRule="auto"/>
+        <w:spacing w:before="200" w:after="120" w:line="240" w:lineRule="auto"/>
         <w:jc w:val="left"/>
       </w:pPr>
       <w:r>
@@ -1846,10 +1484,8 @@
     </w:p>
     <w:p>
       <w:pPr>
-        <w:keepNext w:val="0"/>
-        <w:pageBreakBefore w:val="0"/>
         <w:widowControl/>
-        <w:spacing w:before="0" w:after="200" w:line="276" w:lineRule="auto"/>
+        <w:spacing w:before="0" w:after="0" w:line="276" w:lineRule="auto"/>
         <w:jc w:val="both"/>
       </w:pPr>
       <w:r>
@@ -1866,7 +1502,7 @@
     <w:p>
       <w:pPr>
         <w:pStyle w:val="ListBullet"/>
-        <w:spacing w:before="0" w:after="100" w:line="276" w:lineRule="auto"/>
+        <w:spacing w:before="0" w:after="0" w:line="276" w:lineRule="auto"/>
         <w:ind w:left="432" w:hanging="259"/>
         <w:jc w:val="left"/>
       </w:pPr>
@@ -1884,7 +1520,7 @@
     <w:p>
       <w:pPr>
         <w:pStyle w:val="ListBullet"/>
-        <w:spacing w:before="0" w:after="100" w:line="276" w:lineRule="auto"/>
+        <w:spacing w:before="0" w:after="0" w:line="276" w:lineRule="auto"/>
         <w:ind w:left="432" w:hanging="259"/>
         <w:jc w:val="left"/>
       </w:pPr>
@@ -1902,7 +1538,7 @@
     <w:p>
       <w:pPr>
         <w:pStyle w:val="ListBullet"/>
-        <w:spacing w:before="0" w:after="100" w:line="276" w:lineRule="auto"/>
+        <w:spacing w:before="0" w:after="0" w:line="276" w:lineRule="auto"/>
         <w:ind w:left="432" w:hanging="259"/>
         <w:jc w:val="left"/>
       </w:pPr>
@@ -1919,10 +1555,8 @@
     </w:p>
     <w:p>
       <w:pPr>
-        <w:keepNext w:val="0"/>
-        <w:pageBreakBefore w:val="0"/>
         <w:widowControl/>
-        <w:spacing w:before="0" w:after="200" w:line="276" w:lineRule="auto"/>
+        <w:spacing w:before="0" w:after="0" w:line="276" w:lineRule="auto"/>
         <w:jc w:val="both"/>
       </w:pPr>
       <w:r>
@@ -1933,7 +1567,7 @@
           <w:color w:val="000000"/>
           <w:sz w:val="24"/>
         </w:rPr>
-        <w:t>The browser sends an HTTP request to Flask. The application checks the session, role and CSRF token where required, runs a parameterized query and renders a template with the result. The same route structure supports both desktop and mobile layouts; the responsive interface is implemented in CSS rather than a separate mobile application.</w:t>
+        <w:t>The browser sends an HTTP request to Flask. The application verifies the session, role and CSRF token where required, runs a parameterized query and renders a template with the result. The same route structure powers the desktop and mobile layouts; the responsive behaviour is implemented in CSS rather than a separate mobile application.</w:t>
       </w:r>
     </w:p>
     <w:p>
@@ -1945,7 +1579,7 @@
       <w:r>
         <w:drawing>
           <wp:inline xmlns:a="http://schemas.openxmlformats.org/drawingml/2006/main" xmlns:pic="http://schemas.openxmlformats.org/drawingml/2006/picture">
-            <wp:extent cx="5806440" cy="3266122"/>
+            <wp:extent cx="5715000" cy="3214688"/>
             <wp:docPr id="2" name="Picture 2"/>
             <wp:cNvGraphicFramePr>
               <a:graphicFrameLocks noChangeAspect="1"/>
@@ -1966,7 +1600,7 @@
                   <pic:spPr>
                     <a:xfrm>
                       <a:off x="0" y="0"/>
-                      <a:ext cx="5806440" cy="3266122"/>
+                      <a:ext cx="5715000" cy="3214688"/>
                     </a:xfrm>
                     <a:prstGeom prst="rect"/>
                   </pic:spPr>
@@ -1979,8 +1613,6 @@
     </w:p>
     <w:p>
       <w:pPr>
-        <w:keepNext w:val="0"/>
-        <w:pageBreakBefore w:val="0"/>
         <w:widowControl/>
         <w:spacing w:before="0" w:after="160" w:line="240" w:lineRule="auto"/>
         <w:jc w:val="center"/>
@@ -1998,10 +1630,9 @@
     </w:p>
     <w:p>
       <w:pPr>
-        <w:keepNext/>
         <w:pageBreakBefore w:val="0"/>
         <w:widowControl/>
-        <w:spacing w:before="240" w:after="140" w:line="240" w:lineRule="auto"/>
+        <w:spacing w:before="200" w:after="120" w:line="240" w:lineRule="auto"/>
         <w:jc w:val="left"/>
       </w:pPr>
       <w:r>
@@ -2018,7 +1649,7 @@
     <w:p>
       <w:pPr>
         <w:pStyle w:val="ListBullet"/>
-        <w:spacing w:before="0" w:after="100" w:line="276" w:lineRule="auto"/>
+        <w:spacing w:before="0" w:after="0" w:line="276" w:lineRule="auto"/>
         <w:ind w:left="432" w:hanging="259"/>
         <w:jc w:val="left"/>
       </w:pPr>
@@ -2036,7 +1667,7 @@
     <w:p>
       <w:pPr>
         <w:pStyle w:val="ListBullet"/>
-        <w:spacing w:before="0" w:after="100" w:line="276" w:lineRule="auto"/>
+        <w:spacing w:before="0" w:after="0" w:line="276" w:lineRule="auto"/>
         <w:ind w:left="432" w:hanging="259"/>
         <w:jc w:val="left"/>
       </w:pPr>
@@ -2054,7 +1685,7 @@
     <w:p>
       <w:pPr>
         <w:pStyle w:val="ListBullet"/>
-        <w:spacing w:before="0" w:after="100" w:line="276" w:lineRule="auto"/>
+        <w:spacing w:before="0" w:after="0" w:line="276" w:lineRule="auto"/>
         <w:ind w:left="432" w:hanging="259"/>
         <w:jc w:val="left"/>
       </w:pPr>
@@ -2072,7 +1703,7 @@
     <w:p>
       <w:pPr>
         <w:pStyle w:val="ListBullet"/>
-        <w:spacing w:before="0" w:after="100" w:line="276" w:lineRule="auto"/>
+        <w:spacing w:before="0" w:after="0" w:line="276" w:lineRule="auto"/>
         <w:ind w:left="432" w:hanging="259"/>
         <w:jc w:val="left"/>
       </w:pPr>
@@ -2090,7 +1721,7 @@
     <w:p>
       <w:pPr>
         <w:pStyle w:val="ListBullet"/>
-        <w:spacing w:before="0" w:after="100" w:line="276" w:lineRule="auto"/>
+        <w:spacing w:before="0" w:after="0" w:line="276" w:lineRule="auto"/>
         <w:ind w:left="432" w:hanging="259"/>
         <w:jc w:val="left"/>
       </w:pPr>
@@ -2108,7 +1739,7 @@
     <w:p>
       <w:pPr>
         <w:pStyle w:val="ListBullet"/>
-        <w:spacing w:before="0" w:after="100" w:line="276" w:lineRule="auto"/>
+        <w:spacing w:before="0" w:after="0" w:line="276" w:lineRule="auto"/>
         <w:ind w:left="432" w:hanging="259"/>
         <w:jc w:val="left"/>
       </w:pPr>
@@ -2126,7 +1757,7 @@
     <w:p>
       <w:pPr>
         <w:pStyle w:val="ListBullet"/>
-        <w:spacing w:before="0" w:after="100" w:line="276" w:lineRule="auto"/>
+        <w:spacing w:before="0" w:after="0" w:line="276" w:lineRule="auto"/>
         <w:ind w:left="432" w:hanging="259"/>
         <w:jc w:val="left"/>
       </w:pPr>
@@ -2144,7 +1775,7 @@
     <w:p>
       <w:pPr>
         <w:pStyle w:val="ListBullet"/>
-        <w:spacing w:before="0" w:after="100" w:line="276" w:lineRule="auto"/>
+        <w:spacing w:before="0" w:after="0" w:line="276" w:lineRule="auto"/>
         <w:ind w:left="432" w:hanging="259"/>
         <w:jc w:val="left"/>
       </w:pPr>
@@ -2156,13 +1787,21 @@
           <w:color w:val="000000"/>
           <w:sz w:val="24"/>
         </w:rPr>
-        <w:t>Report diagrams: Matplotlib; screenshots: Playwright at 1440×900 and 390×844.</w:t>
+        <w:t>Diagrams: Matplotlib; screenshots: Playwright at 1440×900 and 390×844.</w:t>
       </w:r>
     </w:p>
     <w:p>
-      <w:pPr>
-        <w:keepNext/>
-        <w:pageBreakBefore/>
+      <w:r>
+        <w:br w:type="page"/>
+      </w:r>
+    </w:p>
+    <w:p>
+      <w:pPr>
+        <w:spacing w:before="0" w:after="200" w:line="240" w:lineRule="auto"/>
+      </w:pPr>
+    </w:p>
+    <w:p>
+      <w:pPr>
         <w:widowControl/>
         <w:spacing w:before="0" w:after="0" w:line="240" w:lineRule="auto"/>
         <w:jc w:val="center"/>
@@ -2180,10 +1819,8 @@
     </w:p>
     <w:p>
       <w:pPr>
-        <w:keepNext/>
-        <w:pageBreakBefore w:val="0"/>
         <w:widowControl/>
-        <w:spacing w:before="0" w:after="360" w:line="240" w:lineRule="auto"/>
+        <w:spacing w:before="0" w:after="320" w:line="240" w:lineRule="auto"/>
         <w:jc w:val="center"/>
       </w:pPr>
       <w:r>
@@ -2199,10 +1836,9 @@
     </w:p>
     <w:p>
       <w:pPr>
-        <w:keepNext/>
         <w:pageBreakBefore w:val="0"/>
         <w:widowControl/>
-        <w:spacing w:before="240" w:after="140" w:line="240" w:lineRule="auto"/>
+        <w:spacing w:before="200" w:after="120" w:line="240" w:lineRule="auto"/>
         <w:jc w:val="left"/>
       </w:pPr>
       <w:r>
@@ -2218,10 +1854,8 @@
     </w:p>
     <w:p>
       <w:pPr>
-        <w:keepNext w:val="0"/>
-        <w:pageBreakBefore w:val="0"/>
         <w:widowControl/>
-        <w:spacing w:before="0" w:after="200" w:line="276" w:lineRule="auto"/>
+        <w:spacing w:before="0" w:after="0" w:line="276" w:lineRule="auto"/>
         <w:jc w:val="both"/>
       </w:pPr>
       <w:r>
@@ -2232,7 +1866,7 @@
           <w:color w:val="000000"/>
           <w:sz w:val="24"/>
         </w:rPr>
-        <w:t>The database is created automatically on first run. The schema uses primary keys, foreign keys, check constraints and a unique constraint on inventory. The following statements define the six tables and their indexes.</w:t>
+        <w:t>The database is created automatically on first run. The schema enforces primary keys, foreign keys, check constraints and a unique constraint on inventory. The statements below define the six tables and their indexes.</w:t>
       </w:r>
     </w:p>
     <w:p>
@@ -2297,7 +1931,7 @@
         <w:br/>
         <w:t xml:space="preserve">  UNIQUE (hospital_id, blood_group),</w:t>
         <w:br/>
-        <w:t xml:space="preserve">  FOREIGN KEY (hospital_id) REFERENCES hospitals(hospital_id) ON DELETE CASCADE</w:t>
+        <w:t xml:space="preserve">  FOREIGN KEY (hospital_id) REFERENCES hospitals(hospital_id)</w:t>
         <w:br/>
         <w:t>);</w:t>
         <w:br/>
@@ -2331,8 +1965,22 @@
         <w:t xml:space="preserve">  FOREIGN KEY (hospital_id) REFERENCES hospitals(hospital_id)</w:t>
         <w:br/>
         <w:t>);</w:t>
-        <w:br/>
-        <w:br/>
+      </w:r>
+    </w:p>
+    <w:p>
+      <w:pPr>
+        <w:spacing w:before="80" w:after="180" w:line="252" w:lineRule="auto"/>
+        <w:ind w:left="317"/>
+        <w:jc w:val="left"/>
+      </w:pPr>
+      <w:r>
+        <w:rPr>
+          <w:rFonts w:ascii="Courier New" w:hAnsi="Courier New" w:cs="Courier New" w:eastAsia="Courier New"/>
+          <w:b w:val="0"/>
+          <w:i w:val="0"/>
+          <w:color w:val="000000"/>
+          <w:sz w:val="18"/>
+        </w:rPr>
         <w:t>CREATE TABLE donations (</w:t>
         <w:br/>
         <w:t xml:space="preserve">  donation_id INTEGER PRIMARY KEY AUTOINCREMENT,</w:t>
@@ -2364,7 +2012,9 @@
         <w:br/>
         <w:t xml:space="preserve">  hospital_id INTEGER NOT NULL,</w:t>
         <w:br/>
-        <w:t xml:space="preserve">  slot_date TEXT NOT NULL, slot_time TEXT NOT NULL,</w:t>
+        <w:t xml:space="preserve">  slot_date TEXT NOT NULL,</w:t>
+        <w:br/>
+        <w:t xml:space="preserve">  slot_time TEXT NOT NULL,</w:t>
         <w:br/>
         <w:t xml:space="preserve">  status TEXT NOT NULL DEFAULT 'Booked'</w:t>
         <w:br/>
@@ -2388,10 +2038,8 @@
     </w:p>
     <w:p>
       <w:pPr>
-        <w:keepNext w:val="0"/>
-        <w:pageBreakBefore w:val="0"/>
         <w:widowControl/>
-        <w:spacing w:before="0" w:after="200" w:line="276" w:lineRule="auto"/>
+        <w:spacing w:before="0" w:after="0" w:line="276" w:lineRule="auto"/>
         <w:jc w:val="both"/>
       </w:pPr>
       <w:r>
@@ -2402,15 +2050,14 @@
           <w:color w:val="000000"/>
           <w:sz w:val="24"/>
         </w:rPr>
-        <w:t>The schema is normalised around one fact per table: a hospital holds stock, a user raises a request, a donor makes a donation and a donor books an appointment. This avoids repeating hospital names inside inventory or donor details inside requests.</w:t>
+        <w:t>The schema holds one fact per table: a hospital holds stock, a user raises a request, a donor makes a donation and a donor books an appointment. Hospital names are never duplicated inside inventory, and donor details are never duplicated inside requests or donations.</w:t>
       </w:r>
     </w:p>
     <w:p>
       <w:pPr>
-        <w:keepNext/>
         <w:pageBreakBefore w:val="0"/>
         <w:widowControl/>
-        <w:spacing w:before="240" w:after="140" w:line="240" w:lineRule="auto"/>
+        <w:spacing w:before="200" w:after="120" w:line="240" w:lineRule="auto"/>
         <w:jc w:val="left"/>
       </w:pPr>
       <w:r>
@@ -2426,10 +2073,8 @@
     </w:p>
     <w:p>
       <w:pPr>
-        <w:keepNext w:val="0"/>
-        <w:pageBreakBefore w:val="0"/>
         <w:widowControl/>
-        <w:spacing w:before="0" w:after="200" w:line="276" w:lineRule="auto"/>
+        <w:spacing w:before="0" w:after="0" w:line="276" w:lineRule="auto"/>
         <w:jc w:val="both"/>
       </w:pPr>
       <w:r>
@@ -2440,7 +2085,7 @@
           <w:color w:val="000000"/>
           <w:sz w:val="24"/>
         </w:rPr>
-        <w:t>A new SQLite connection is opened for each Flask application context. Foreign-key enforcement is switched on explicitly because SQLite does not enable it by default. A teardown hook closes the connection at the end of the request.</w:t>
+        <w:t>A SQLite connection is opened per Flask application context. Foreign-key enforcement is switched on explicitly because SQLite does not enable it by default. A teardown hook closes the connection at the end of the request.</w:t>
       </w:r>
     </w:p>
     <w:p>
@@ -2511,10 +2156,9 @@
     </w:p>
     <w:p>
       <w:pPr>
-        <w:keepNext/>
         <w:pageBreakBefore w:val="0"/>
         <w:widowControl/>
-        <w:spacing w:before="240" w:after="140" w:line="240" w:lineRule="auto"/>
+        <w:spacing w:before="200" w:after="120" w:line="240" w:lineRule="auto"/>
         <w:jc w:val="left"/>
       </w:pPr>
       <w:r>
@@ -2530,10 +2174,8 @@
     </w:p>
     <w:p>
       <w:pPr>
-        <w:keepNext w:val="0"/>
-        <w:pageBreakBefore w:val="0"/>
         <w:widowControl/>
-        <w:spacing w:before="0" w:after="200" w:line="276" w:lineRule="auto"/>
+        <w:spacing w:before="0" w:after="0" w:line="276" w:lineRule="auto"/>
         <w:jc w:val="both"/>
       </w:pPr>
       <w:r>
@@ -2549,10 +2191,8 @@
     </w:p>
     <w:p>
       <w:pPr>
-        <w:keepNext w:val="0"/>
-        <w:pageBreakBefore w:val="0"/>
         <w:widowControl/>
-        <w:spacing w:before="0" w:after="200" w:line="276" w:lineRule="auto"/>
+        <w:spacing w:before="0" w:after="0" w:line="276" w:lineRule="auto"/>
         <w:jc w:val="both"/>
       </w:pPr>
       <w:r>
@@ -2563,7 +2203,7 @@
           <w:color w:val="000000"/>
           <w:sz w:val="24"/>
         </w:rPr>
-        <w:t>Every POST request is checked by a before_request hook. The token is generated per session, embedded in forms and in a meta tag for fetch calls, and compared using secrets.compare_digest. A missing or stale token is rejected before the route can change data.</w:t>
+        <w:t>Every POST is guarded by a before_request hook. The token is generated per session, embedded in forms and in a meta tag for fetch calls, and compared with secrets.compare_digest. A missing or stale token is rejected before the route can touch data.</w:t>
       </w:r>
     </w:p>
     <w:p>
@@ -2586,7 +2226,9 @@
         <w:br/>
         <w:t xml:space="preserve">    if request.method == "POST":</w:t>
         <w:br/>
-        <w:t xml:space="preserve">        sent = request.form.get("csrf_token") or request.headers.get("X-CSRF-Token")</w:t>
+        <w:t xml:space="preserve">        sent = (request.form.get("csrf_token")</w:t>
+        <w:br/>
+        <w:t xml:space="preserve">                or request.headers.get("X-CSRF-Token"))</w:t>
         <w:br/>
         <w:t xml:space="preserve">        if not sent or not secrets.compare_digest(sent, session.get("csrf", "")):</w:t>
         <w:br/>
@@ -2595,14 +2237,45 @@
         <w:t xml:space="preserve">                return jsonify({"error": "Invalid CSRF token."}), 400</w:t>
         <w:br/>
         <w:t xml:space="preserve">            abort(400, description="Invalid CSRF token.")</w:t>
+        <w:br/>
+        <w:br/>
+        <w:t>def login_required(view):</w:t>
+        <w:br/>
+        <w:t xml:space="preserve">    @wraps(view)</w:t>
+        <w:br/>
+        <w:t xml:space="preserve">    def wrapped(*args, **kwargs):</w:t>
+        <w:br/>
+        <w:t xml:space="preserve">        if not session.get("user_id"):</w:t>
+        <w:br/>
+        <w:t xml:space="preserve">            flash("Please sign in to continue.", "error")</w:t>
+        <w:br/>
+        <w:t xml:space="preserve">            return redirect(url_for("login"))</w:t>
+        <w:br/>
+        <w:t xml:space="preserve">        return view(*args, **kwargs)</w:t>
+        <w:br/>
+        <w:t xml:space="preserve">    return wrapped</w:t>
+        <w:br/>
+        <w:br/>
+        <w:t>def admin_required(view):</w:t>
+        <w:br/>
+        <w:t xml:space="preserve">    @wraps(view)</w:t>
+        <w:br/>
+        <w:t xml:space="preserve">    def wrapped(*args, **kwargs):</w:t>
+        <w:br/>
+        <w:t xml:space="preserve">        if session.get("role") != "admin":</w:t>
+        <w:br/>
+        <w:t xml:space="preserve">            abort(403)</w:t>
+        <w:br/>
+        <w:t xml:space="preserve">        return view(*args, **kwargs)</w:t>
+        <w:br/>
+        <w:t xml:space="preserve">    return wrapped</w:t>
       </w:r>
     </w:p>
     <w:p>
       <w:pPr>
-        <w:keepNext/>
         <w:pageBreakBefore w:val="0"/>
         <w:widowControl/>
-        <w:spacing w:before="240" w:after="140" w:line="240" w:lineRule="auto"/>
+        <w:spacing w:before="200" w:after="120" w:line="240" w:lineRule="auto"/>
         <w:jc w:val="left"/>
       </w:pPr>
       <w:r>
@@ -2618,10 +2291,8 @@
     </w:p>
     <w:p>
       <w:pPr>
-        <w:keepNext w:val="0"/>
-        <w:pageBreakBefore w:val="0"/>
         <w:widowControl/>
-        <w:spacing w:before="0" w:after="200" w:line="276" w:lineRule="auto"/>
+        <w:spacing w:before="0" w:after="0" w:line="276" w:lineRule="auto"/>
         <w:jc w:val="both"/>
       </w:pPr>
       <w:r>
@@ -2632,7 +2303,7 @@
           <w:color w:val="000000"/>
           <w:sz w:val="24"/>
         </w:rPr>
-        <w:t>Status changes are not accepted as free text. The API defines the allowed next state for each current state and returns HTTP 409 for an invalid transition. Completion performs a stock read for the request's hospital and blood group; if the row is missing or holds fewer units than requested, the transition is refused. Only then is the inventory decremented and the request marked Completed.</w:t>
+        <w:t>Status changes are not accepted as free text. The API defines the permitted next state for each current state and returns HTTP 409 for an invalid transition. Completion reads the inventory row for the request's hospital and blood group, refuses the transition if there are not enough units, and only then decrements the inventory and marks the request Completed.</w:t>
       </w:r>
     </w:p>
     <w:p>
@@ -2661,6 +2332,7 @@
         <w:br/>
         <w:t>}</w:t>
         <w:br/>
+        <w:br/>
         <w:t>if new_status not in allowed.get(row["status"], set()):</w:t>
         <w:br/>
         <w:t xml:space="preserve">    return jsonify({"error": "Invalid transition."}), 409</w:t>
@@ -2668,17 +2340,22 @@
         <w:br/>
         <w:t>if new_status == "Completed":</w:t>
         <w:br/>
-        <w:t xml:space="preserve">    inv = query("SELECT * FROM inventory WHERE hospital_id = ? AND blood_group = ?",</w:t>
+        <w:t xml:space="preserve">    inv = query(</w:t>
         <w:br/>
-        <w:t xml:space="preserve">                (row["hospital_id"], row["blood_group"]), one=True)</w:t>
+        <w:t xml:space="preserve">        "SELECT * FROM inventory WHERE hospital_id = ? AND blood_group = ?",</w:t>
+        <w:br/>
+        <w:t xml:space="preserve">        (row["hospital_id"], row["blood_group"]), one=True)</w:t>
         <w:br/>
         <w:t xml:space="preserve">    if not inv or inv["units"] &lt; row["units"]:</w:t>
         <w:br/>
         <w:t xml:space="preserve">        return jsonify({"error": "Not enough units in stock."}), 409</w:t>
         <w:br/>
-        <w:t xml:space="preserve">    execute("UPDATE inventory SET units = units - ? WHERE inventory_id = ?",</w:t>
+        <w:t xml:space="preserve">    execute("UPDATE inventory SET units = units - ? "</w:t>
+        <w:br/>
+        <w:t xml:space="preserve">            "WHERE inventory_id = ?",</w:t>
         <w:br/>
         <w:t xml:space="preserve">            (row["units"], inv["inventory_id"]))</w:t>
+        <w:br/>
         <w:br/>
         <w:t>execute("UPDATE requests SET status = ? WHERE request_id = ?",</w:t>
         <w:br/>
@@ -2687,10 +2364,9 @@
     </w:p>
     <w:p>
       <w:pPr>
-        <w:keepNext/>
         <w:pageBreakBefore w:val="0"/>
         <w:widowControl/>
-        <w:spacing w:before="240" w:after="140" w:line="240" w:lineRule="auto"/>
+        <w:spacing w:before="200" w:after="120" w:line="240" w:lineRule="auto"/>
         <w:jc w:val="left"/>
       </w:pPr>
       <w:r>
@@ -2701,15 +2377,13 @@
           <w:color w:val="000000"/>
           <w:sz w:val="28"/>
         </w:rPr>
-        <w:t>3.5 Search Implementation</w:t>
+        <w:t>3.5 Availability Search Implementation</w:t>
       </w:r>
     </w:p>
     <w:p>
       <w:pPr>
-        <w:keepNext w:val="0"/>
-        <w:pageBreakBefore w:val="0"/>
         <w:widowControl/>
-        <w:spacing w:before="0" w:after="200" w:line="276" w:lineRule="auto"/>
+        <w:spacing w:before="0" w:after="0" w:line="276" w:lineRule="auto"/>
         <w:jc w:val="both"/>
       </w:pPr>
       <w:r>
@@ -2720,7 +2394,7 @@
           <w:color w:val="000000"/>
           <w:sz w:val="24"/>
         </w:rPr>
-        <w:t>Search is built from optional predicates instead of separate queries for every combination. A blood group uses exact equality, while a city uses a parameterized LIKE. The query joins inventory to hospitals so the result can show the site name, city and phone number without duplicating those fields in the inventory table.</w:t>
+        <w:t>Search is built from optional predicates rather than separate queries for every combination. A blood group uses exact equality, while a city uses a parameterized LIKE. The query joins inventory to hospitals so the result can show the site name, city and phone number without duplicating those fields inside the inventory table.</w:t>
       </w:r>
     </w:p>
     <w:p>
@@ -2737,29 +2411,41 @@
           <w:color w:val="000000"/>
           <w:sz w:val="18"/>
         </w:rPr>
-        <w:t>SELECT i.blood_group, i.units, i.updated_at, h.name, h.city, h.phone</w:t>
+        <w:t>sql = """</w:t>
         <w:br/>
-        <w:t>FROM inventory i</w:t>
+        <w:t xml:space="preserve">    SELECT i.blood_group, i.units, i.updated_at,</w:t>
         <w:br/>
-        <w:t>JOIN hospitals h ON h.hospital_id = i.hospital_id</w:t>
+        <w:t xml:space="preserve">           h.name, h.city, h.phone</w:t>
         <w:br/>
-        <w:t>WHERE 1=1</w:t>
+        <w:t xml:space="preserve">    FROM inventory i</w:t>
         <w:br/>
-        <w:t xml:space="preserve">  AND i.blood_group = ?</w:t>
+        <w:t xml:space="preserve">    JOIN hospitals h ON h.hospital_id = i.hospital_id</w:t>
         <w:br/>
-        <w:t xml:space="preserve">  AND h.city LIKE ?</w:t>
+        <w:t xml:space="preserve">    WHERE 1=1</w:t>
         <w:br/>
-        <w:t xml:space="preserve">  AND i.units &gt; 0</w:t>
+        <w:t>"""</w:t>
         <w:br/>
-        <w:t>ORDER BY i.units DESC, h.name;</w:t>
+        <w:t>if blood:</w:t>
+        <w:br/>
+        <w:t xml:space="preserve">    sql += " AND i.blood_group = ?"</w:t>
+        <w:br/>
+        <w:t xml:space="preserve">    args.append(blood)</w:t>
+        <w:br/>
+        <w:t>if city:</w:t>
+        <w:br/>
+        <w:t xml:space="preserve">    sql += " AND h.city LIKE ?"</w:t>
+        <w:br/>
+        <w:t xml:space="preserve">    args.append(f"%{city}%")</w:t>
+        <w:br/>
+        <w:t>sql += " AND i.units &gt; 0 ORDER BY i.units DESC, h.name"</w:t>
+        <w:br/>
+        <w:t>rows = query(sql, args)</w:t>
       </w:r>
     </w:p>
     <w:p>
       <w:pPr>
-        <w:keepNext w:val="0"/>
-        <w:pageBreakBefore w:val="0"/>
         <w:widowControl/>
-        <w:spacing w:before="0" w:after="200" w:line="276" w:lineRule="auto"/>
+        <w:spacing w:before="0" w:after="0" w:line="276" w:lineRule="auto"/>
         <w:jc w:val="both"/>
       </w:pPr>
       <w:r>
@@ -2770,15 +2456,14 @@
           <w:color w:val="000000"/>
           <w:sz w:val="24"/>
         </w:rPr>
-        <w:t>Values are always bound as parameters. An injection-style city string is treated as literal data and returns no rows rather than changing the query structure.</w:t>
+        <w:t>Values are always bound as parameters. An injection-style city string is treated as literal data and returns zero rows rather than altering the query structure.</w:t>
       </w:r>
     </w:p>
     <w:p>
       <w:pPr>
-        <w:keepNext/>
         <w:pageBreakBefore w:val="0"/>
         <w:widowControl/>
-        <w:spacing w:before="240" w:after="140" w:line="240" w:lineRule="auto"/>
+        <w:spacing w:before="200" w:after="120" w:line="240" w:lineRule="auto"/>
         <w:jc w:val="left"/>
       </w:pPr>
       <w:r>
@@ -2794,10 +2479,8 @@
     </w:p>
     <w:p>
       <w:pPr>
-        <w:keepNext w:val="0"/>
-        <w:pageBreakBefore w:val="0"/>
         <w:widowControl/>
-        <w:spacing w:before="0" w:after="200" w:line="276" w:lineRule="auto"/>
+        <w:spacing w:before="0" w:after="0" w:line="276" w:lineRule="auto"/>
         <w:jc w:val="both"/>
       </w:pPr>
       <w:r>
@@ -2808,7 +2491,7 @@
           <w:color w:val="000000"/>
           <w:sz w:val="24"/>
         </w:rPr>
-        <w:t>The donor dashboard combines eligibility, history, appointments and requests on one page. Eligibility is calculated from the most recent donation plus a 90-day cooldown. The function returns the last donation date, the next eligible date, the days remaining and the donor's lifetime totals.</w:t>
+        <w:t>The donor dashboard combines eligibility, history, appointments and requests on one page. Eligibility is computed from the most recent donation plus a 90-day cooldown, and the same page exposes appointment booking and personal request submission.</w:t>
       </w:r>
     </w:p>
     <w:p>
@@ -2833,9 +2516,7 @@
         <w:br/>
         <w:t xml:space="preserve">        "ORDER BY donation_date DESC LIMIT 1",</w:t>
         <w:br/>
-        <w:t xml:space="preserve">        (user_id,), one=True</w:t>
-        <w:br/>
-        <w:t xml:space="preserve">    )</w:t>
+        <w:t xml:space="preserve">        (user_id,), one=True)</w:t>
         <w:br/>
         <w:t xml:space="preserve">    total = query(</w:t>
         <w:br/>
@@ -2843,9 +2524,7 @@
         <w:br/>
         <w:t xml:space="preserve">        "FROM donations WHERE donor_id = ?",</w:t>
         <w:br/>
-        <w:t xml:space="preserve">        (user_id,), one=True</w:t>
-        <w:br/>
-        <w:t xml:space="preserve">    )</w:t>
+        <w:t xml:space="preserve">        (user_id,), one=True)</w:t>
         <w:br/>
         <w:t xml:space="preserve">    last_date = next_date = None</w:t>
         <w:br/>
@@ -2855,54 +2534,17 @@
         <w:br/>
         <w:t xml:space="preserve">        last_date = datetime.strptime(last["donation_date"], "%Y-%m-%d").date()</w:t>
         <w:br/>
-        <w:t xml:space="preserve">        next_date = last_date + timedelta(days=DONOR_COOLDOWN_DAYS)</w:t>
+        <w:t xml:space="preserve">        next_date = last_date + timedelta(days=90)</w:t>
         <w:br/>
         <w:t xml:space="preserve">        days_left = max(0, (next_date - date.today()).days)</w:t>
         <w:br/>
-        <w:t xml:space="preserve">    return {</w:t>
+        <w:t xml:space="preserve">    return {"last_date": last_date, "next_date": next_date,</w:t>
         <w:br/>
-        <w:t xml:space="preserve">        "last_date": last_date, "next_date": next_date,</w:t>
+        <w:t xml:space="preserve">            "days_left": days_left, "eligible": days_left == 0,</w:t>
         <w:br/>
-        <w:t xml:space="preserve">        "days_left": days_left, "eligible": days_left == 0,</w:t>
+        <w:t xml:space="preserve">            "count": total["c"], "units": total["u"]}")</w:t>
         <w:br/>
-        <w:t xml:space="preserve">        "count": total["c"], "units": total["u"],</w:t>
         <w:br/>
-        <w:t xml:space="preserve">    }</w:t>
-      </w:r>
-    </w:p>
-    <w:p>
-      <w:pPr>
-        <w:keepNext w:val="0"/>
-        <w:pageBreakBefore w:val="0"/>
-        <w:widowControl/>
-        <w:spacing w:before="0" w:after="200" w:line="276" w:lineRule="auto"/>
-        <w:jc w:val="both"/>
-      </w:pPr>
-      <w:r>
-        <w:rPr>
-          <w:rFonts w:ascii="Times New Roman" w:hAnsi="Times New Roman" w:cs="Times New Roman" w:eastAsia="Times New Roman"/>
-          <w:b w:val="0"/>
-          <w:i w:val="0"/>
-          <w:color w:val="000000"/>
-          <w:sz w:val="24"/>
-        </w:rPr>
-        <w:t>Appointment booking validates the hospital, date and time before inserting the row. Cancellation checks ownership on the server, so a donor cannot cancel another donor's appointment by changing the URL. The donor's request form follows the same pattern: validate the selected hospital, blood group, unit count and urgency, then insert the request with Pending status.</w:t>
-      </w:r>
-    </w:p>
-    <w:p>
-      <w:pPr>
-        <w:spacing w:before="80" w:after="180" w:line="252" w:lineRule="auto"/>
-        <w:ind w:left="317"/>
-        <w:jc w:val="left"/>
-      </w:pPr>
-      <w:r>
-        <w:rPr>
-          <w:rFonts w:ascii="Courier New" w:hAnsi="Courier New" w:cs="Courier New" w:eastAsia="Courier New"/>
-          <w:b w:val="0"/>
-          <w:i w:val="0"/>
-          <w:color w:val="000000"/>
-          <w:sz w:val="18"/>
-        </w:rPr>
         <w:t>@app.route("/book", methods=["POST"])</w:t>
         <w:br/>
         <w:t>@login_required</w:t>
@@ -2915,12 +2557,6 @@
         <w:br/>
         <w:t xml:space="preserve">    slot_time = request.form.get("slot_time", "")</w:t>
         <w:br/>
-        <w:t xml:space="preserve">    if not hospital_id or not slot_date or not slot_time:</w:t>
-        <w:br/>
-        <w:t xml:space="preserve">        flash("Choose a hospital, date and time.", "error")</w:t>
-        <w:br/>
-        <w:t xml:space="preserve">        return redirect(url_for("donor_dashboard"))</w:t>
-        <w:br/>
         <w:t xml:space="preserve">    chosen = datetime.strptime(slot_date, "%Y-%m-%d").date()</w:t>
         <w:br/>
         <w:t xml:space="preserve">    if chosen &lt; date.today():</w:t>
@@ -2929,42 +2565,18 @@
         <w:br/>
         <w:t xml:space="preserve">        return redirect(url_for("donor_dashboard"))</w:t>
         <w:br/>
-        <w:t xml:space="preserve">    execute(</w:t>
+        <w:t xml:space="preserve">    execute("INSERT INTO appointments (donor_id,hospital_id,slot_date,slot_time) "</w:t>
         <w:br/>
-        <w:t xml:space="preserve">        "INSERT INTO appointments "</w:t>
+        <w:t xml:space="preserve">            "VALUES (?,?,?,?)",</w:t>
         <w:br/>
-        <w:t xml:space="preserve">        "(donor_id,hospital_id,slot_date,slot_time) VALUES (?,?,?,?)",</w:t>
-        <w:br/>
-        <w:t xml:space="preserve">        (session["user_id"], hospital_id, slot_date, slot_time),</w:t>
-        <w:br/>
-        <w:t xml:space="preserve">    )</w:t>
-        <w:br/>
-        <w:br/>
-        <w:t>@app.route("/appointment/&lt;int:appointment_id&gt;/cancel", methods=["POST"])</w:t>
-        <w:br/>
-        <w:t>@login_required</w:t>
-        <w:br/>
-        <w:t>def cancel_appointment(appointment_id):</w:t>
-        <w:br/>
-        <w:t xml:space="preserve">    row = query("SELECT * FROM appointments WHERE appointment_id = ?",</w:t>
-        <w:br/>
-        <w:t xml:space="preserve">                (appointment_id,), one=True)</w:t>
-        <w:br/>
-        <w:t xml:space="preserve">    if not row or row["donor_id"] != session["user_id"]:</w:t>
-        <w:br/>
-        <w:t xml:space="preserve">        abort(404)</w:t>
-        <w:br/>
-        <w:t xml:space="preserve">    execute("UPDATE appointments SET status = 'Cancelled' "</w:t>
-        <w:br/>
-        <w:t xml:space="preserve">            "WHERE appointment_id = ?", (appointment_id,))</w:t>
+        <w:t xml:space="preserve">            (session["user_id"], hospital_id, slot_date, slot_time))</w:t>
       </w:r>
     </w:p>
     <w:p>
       <w:pPr>
-        <w:keepNext/>
         <w:pageBreakBefore w:val="0"/>
         <w:widowControl/>
-        <w:spacing w:before="240" w:after="140" w:line="240" w:lineRule="auto"/>
+        <w:spacing w:before="200" w:after="120" w:line="240" w:lineRule="auto"/>
         <w:jc w:val="left"/>
       </w:pPr>
       <w:r>
@@ -2980,10 +2592,8 @@
     </w:p>
     <w:p>
       <w:pPr>
-        <w:keepNext w:val="0"/>
-        <w:pageBreakBefore w:val="0"/>
         <w:widowControl/>
-        <w:spacing w:before="0" w:after="200" w:line="276" w:lineRule="auto"/>
+        <w:spacing w:before="0" w:after="0" w:line="276" w:lineRule="auto"/>
         <w:jc w:val="both"/>
       </w:pPr>
       <w:r>
@@ -2994,7 +2604,7 @@
           <w:color w:val="000000"/>
           <w:sz w:val="24"/>
         </w:rPr>
-        <w:t>The administrator board summarises stock by blood group, marks critical groups, lists pending requests and shows recent donations and hospital totals. The pending-request query joins users and hospitals so each paper slip can show the requester, reference, blood group, unit count, urgency and hospital without storing duplicate names in the requests table.</w:t>
+        <w:t>The administrator board summarises stock by blood group, marks critical groups, and lists pending requests, recent donations and hospital totals. Each pending-request slip joins users and hospitals so it can show the requester, reference, blood group, unit count, urgency and hospital without storing duplicate names.</w:t>
       </w:r>
     </w:p>
     <w:p>
@@ -3034,10 +2644,8 @@
     </w:p>
     <w:p>
       <w:pPr>
-        <w:keepNext w:val="0"/>
-        <w:pageBreakBefore w:val="0"/>
         <w:widowControl/>
-        <w:spacing w:before="0" w:after="200" w:line="276" w:lineRule="auto"/>
+        <w:spacing w:before="0" w:after="0" w:line="276" w:lineRule="auto"/>
         <w:jc w:val="both"/>
       </w:pPr>
       <w:r>
@@ -3077,68 +2685,32 @@
         <w:br/>
         <w:t xml:space="preserve">        hospital_id = request.form.get("hospital_id", type=int)</w:t>
         <w:br/>
-        <w:t xml:space="preserve">        donation_date = request.form.get("donation_date", "")</w:t>
-        <w:br/>
         <w:t xml:space="preserve">        units = request.form.get("units", type=int) or 1</w:t>
         <w:br/>
-        <w:t xml:space="preserve">        execute(</w:t>
+        <w:t xml:space="preserve">        execute("INSERT INTO donations (donor_id,hospital_id,donation_date,units,note) "</w:t>
         <w:br/>
-        <w:t xml:space="preserve">            "INSERT INTO donations "</w:t>
+        <w:t xml:space="preserve">                "VALUES (?,?,?,?,?)",</w:t>
         <w:br/>
-        <w:t xml:space="preserve">            "(donor_id,hospital_id,donation_date,units,note) "</w:t>
+        <w:t xml:space="preserve">                (donor_id, hospital_id, donation_date, units, note))</w:t>
         <w:br/>
-        <w:t xml:space="preserve">            "VALUES (?,?,?,?,?)",</w:t>
+        <w:t xml:space="preserve">        group = query("SELECT blood_group FROM users WHERE user_id = ?",</w:t>
         <w:br/>
-        <w:t xml:space="preserve">            (donor_id, hospital_id, donation_date, units, note),</w:t>
+        <w:t xml:space="preserve">                      (donor_id,), one=True)["blood_group"]</w:t>
         <w:br/>
-        <w:t xml:space="preserve">        )</w:t>
+        <w:t xml:space="preserve">        execute("UPDATE inventory SET units = units + ? "</w:t>
         <w:br/>
-        <w:t xml:space="preserve">        group = query(</w:t>
+        <w:t xml:space="preserve">                "WHERE hospital_id = ? AND blood_group = ?",</w:t>
         <w:br/>
-        <w:t xml:space="preserve">            "SELECT blood_group FROM users WHERE user_id = ?",</w:t>
-        <w:br/>
-        <w:t xml:space="preserve">            (donor_id,), one=True</w:t>
-        <w:br/>
-        <w:t xml:space="preserve">        )["blood_group"]</w:t>
-        <w:br/>
-        <w:t xml:space="preserve">        execute(</w:t>
-        <w:br/>
-        <w:t xml:space="preserve">            "UPDATE inventory SET units = units + ? "</w:t>
-        <w:br/>
-        <w:t xml:space="preserve">            "WHERE hospital_id = ? AND blood_group = ?",</w:t>
-        <w:br/>
-        <w:t xml:space="preserve">            (units, hospital_id, group),</w:t>
-        <w:br/>
-        <w:t xml:space="preserve">        )</w:t>
+        <w:t xml:space="preserve">                (units, hospital_id, group))</w:t>
         <w:br/>
         <w:t xml:space="preserve">    return render_template("admin_donations.html", ...)</w:t>
       </w:r>
     </w:p>
     <w:p>
       <w:pPr>
-        <w:keepNext w:val="0"/>
         <w:pageBreakBefore w:val="0"/>
         <w:widowControl/>
-        <w:spacing w:before="0" w:after="200" w:line="276" w:lineRule="auto"/>
-        <w:jc w:val="both"/>
-      </w:pPr>
-      <w:r>
-        <w:rPr>
-          <w:rFonts w:ascii="Times New Roman" w:hAnsi="Times New Roman" w:cs="Times New Roman" w:eastAsia="Times New Roman"/>
-          <w:b w:val="0"/>
-          <w:i w:val="0"/>
-          <w:color w:val="000000"/>
-          <w:sz w:val="24"/>
-        </w:rPr>
-        <w:t>The same module provides hospital management, inventory management, donor search and the request queue. The request queue exposes only the actions permitted by the current state: Pending requests can be approved or declined; Approved requests can be completed or cancelled; terminal rows remain visible as filed records.</w:t>
-      </w:r>
-    </w:p>
-    <w:p>
-      <w:pPr>
-        <w:keepNext/>
-        <w:pageBreakBefore w:val="0"/>
-        <w:widowControl/>
-        <w:spacing w:before="240" w:after="140" w:line="240" w:lineRule="auto"/>
+        <w:spacing w:before="200" w:after="120" w:line="240" w:lineRule="auto"/>
         <w:jc w:val="left"/>
       </w:pPr>
       <w:r>
@@ -3154,10 +2726,8 @@
     </w:p>
     <w:p>
       <w:pPr>
-        <w:keepNext w:val="0"/>
-        <w:pageBreakBefore w:val="0"/>
         <w:widowControl/>
-        <w:spacing w:before="0" w:after="200" w:line="276" w:lineRule="auto"/>
+        <w:spacing w:before="0" w:after="0" w:line="276" w:lineRule="auto"/>
         <w:jc w:val="both"/>
       </w:pPr>
       <w:r>
@@ -3168,15 +2738,13 @@
           <w:color w:val="000000"/>
           <w:sz w:val="24"/>
         </w:rPr>
-        <w:t>The interface uses a hospital dispatch-desk metaphor rather than a generic admin template. Cream paper, an oxidized-red rail, ink typography, amber signals and teal approvals create a clear operational surface. Stock is shown as paper strips with split-flap counters; pending requests are paper slips; approval presses a rubber stamp before the slip is filed.</w:t>
+        <w:t>The interface uses a hospital dispatch-desk metaphor rather than a generic admin template. Cream paper, an oxidized-red rail, ink typography, amber signals and teal approvals form a clear operational surface. Stock is rendered as paper strips with split-flap counters; pending requests appear as paper slips; approval presses a rubber stamp before the slip is filed.</w:t>
       </w:r>
     </w:p>
     <w:p>
       <w:pPr>
-        <w:keepNext w:val="0"/>
-        <w:pageBreakBefore w:val="0"/>
         <w:widowControl/>
-        <w:spacing w:before="0" w:after="200" w:line="276" w:lineRule="auto"/>
+        <w:spacing w:before="0" w:after="0" w:line="276" w:lineRule="auto"/>
         <w:jc w:val="both"/>
       </w:pPr>
       <w:r>
@@ -3187,51 +2755,21 @@
           <w:color w:val="000000"/>
           <w:sz w:val="24"/>
         </w:rPr>
-        <w:t>The layout is responsive. At mobile width the fixed rail becomes a compact header with a horizontally scrollable navigation strip, the board collapses to one column, stock strips become two-up and action buttons grow to a 40-pixel minimum height. Wide tables scroll inside their own container. A reduced-motion media query collapses animation and transition durations and reveals all content immediately, so no state depends on motion.</w:t>
+        <w:t>The layout is responsive. At mobile width the fixed rail becomes a compact header with a horizontally scrollable navigation strip, the board collapses to one column, stock strips become two-up and action buttons grow to a 40-pixel minimum height. Wide tables scroll inside their own container. A reduced-motion media query collapses animation and reveals all content immediately, so no state depends on motion.</w:t>
       </w:r>
     </w:p>
     <w:p>
-      <w:pPr>
-        <w:keepNext/>
-        <w:pageBreakBefore w:val="0"/>
-        <w:widowControl/>
-        <w:spacing w:before="240" w:after="140" w:line="240" w:lineRule="auto"/>
-        <w:jc w:val="left"/>
-      </w:pPr>
       <w:r>
-        <w:rPr>
-          <w:rFonts w:ascii="Times New Roman" w:hAnsi="Times New Roman" w:cs="Times New Roman" w:eastAsia="Times New Roman"/>
-          <w:b/>
-          <w:i w:val="0"/>
-          <w:color w:val="000000"/>
-          <w:sz w:val="28"/>
-        </w:rPr>
-        <w:t>3.9 Transaction Handling and Data Integrity</w:t>
+        <w:br w:type="page"/>
       </w:r>
     </w:p>
     <w:p>
       <w:pPr>
-        <w:keepNext w:val="0"/>
-        <w:pageBreakBefore w:val="0"/>
-        <w:widowControl/>
-        <w:spacing w:before="0" w:after="200" w:line="276" w:lineRule="auto"/>
-        <w:jc w:val="both"/>
-      </w:pPr>
-      <w:r>
-        <w:rPr>
-          <w:rFonts w:ascii="Times New Roman" w:hAnsi="Times New Roman" w:cs="Times New Roman" w:eastAsia="Times New Roman"/>
-          <w:b w:val="0"/>
-          <w:i w:val="0"/>
-          <w:color w:val="000000"/>
-          <w:sz w:val="24"/>
-        </w:rPr>
-        <w:t>Insert, update and delete operations are followed by commit in the execute helper. SQLite transactions ensure that a request status update and its stock deduction are not partially applied. Foreign keys protect relationships, the inventory check prevents negative stock, and the unique constraint prevents duplicate stock lines for the same hospital and blood group. Validation is repeated on the server even when the browser also provides constraints.</w:t>
-      </w:r>
+        <w:spacing w:before="0" w:after="200" w:line="240" w:lineRule="auto"/>
+      </w:pPr>
     </w:p>
     <w:p>
       <w:pPr>
-        <w:keepNext/>
-        <w:pageBreakBefore/>
         <w:widowControl/>
         <w:spacing w:before="0" w:after="0" w:line="240" w:lineRule="auto"/>
         <w:jc w:val="center"/>
@@ -3249,10 +2787,8 @@
     </w:p>
     <w:p>
       <w:pPr>
-        <w:keepNext/>
-        <w:pageBreakBefore w:val="0"/>
         <w:widowControl/>
-        <w:spacing w:before="0" w:after="360" w:line="240" w:lineRule="auto"/>
+        <w:spacing w:before="0" w:after="320" w:line="240" w:lineRule="auto"/>
         <w:jc w:val="center"/>
       </w:pPr>
       <w:r>
@@ -3268,10 +2804,8 @@
     </w:p>
     <w:p>
       <w:pPr>
-        <w:keepNext w:val="0"/>
-        <w:pageBreakBefore w:val="0"/>
         <w:widowControl/>
-        <w:spacing w:before="0" w:after="200" w:line="276" w:lineRule="auto"/>
+        <w:spacing w:before="0" w:after="0" w:line="276" w:lineRule="auto"/>
         <w:jc w:val="both"/>
       </w:pPr>
       <w:r>
@@ -3282,15 +2816,14 @@
           <w:color w:val="000000"/>
           <w:sz w:val="24"/>
         </w:rPr>
-        <w:t>The Online Blood Bank and Donor Management System was implemented using Python, Flask, SQLite and a responsive HTML interface. The following screens were captured from the running application with the synthetic demo database. Each screen is followed by the implemented features and the observed result.</w:t>
+        <w:t>The Online Blood Bank and Donor Management System was implemented using Python, Flask, SQLite and a responsive HTML interface. The following screens were captured from the running application with the seeded synthetic demo database. Each screen is followed by the implemented features and the observed result.</w:t>
       </w:r>
     </w:p>
     <w:p>
       <w:pPr>
-        <w:keepNext/>
         <w:pageBreakBefore w:val="0"/>
         <w:widowControl/>
-        <w:spacing w:before="240" w:after="140" w:line="240" w:lineRule="auto"/>
+        <w:spacing w:before="200" w:after="120" w:line="240" w:lineRule="auto"/>
         <w:jc w:val="left"/>
       </w:pPr>
       <w:r>
@@ -3347,8 +2880,6 @@
     </w:p>
     <w:p>
       <w:pPr>
-        <w:keepNext w:val="0"/>
-        <w:pageBreakBefore w:val="0"/>
         <w:widowControl/>
         <w:spacing w:before="0" w:after="160" w:line="240" w:lineRule="auto"/>
         <w:jc w:val="center"/>
@@ -3366,10 +2897,8 @@
     </w:p>
     <w:p>
       <w:pPr>
-        <w:keepNext w:val="0"/>
-        <w:pageBreakBefore w:val="0"/>
         <w:widowControl/>
-        <w:spacing w:before="0" w:after="200" w:line="276" w:lineRule="auto"/>
+        <w:spacing w:before="0" w:after="0" w:line="276" w:lineRule="auto"/>
         <w:jc w:val="both"/>
       </w:pPr>
       <w:r>
@@ -3380,12 +2909,12 @@
           <w:color w:val="000000"/>
           <w:sz w:val="24"/>
         </w:rPr>
-        <w:t>This is the entry screen for donors and administrators. Users enter their email and password; the server verifies the password hash, creates a signed session and redirects the user according to their role.</w:t>
+        <w:t>This is the entry screen for donors and administrators. The server verifies the password hash, creates a signed session, and redirects the user according to their role.</w:t>
       </w:r>
     </w:p>
     <w:p>
       <w:pPr>
-        <w:spacing w:before="40" w:after="160" w:line="276" w:lineRule="auto"/>
+        <w:spacing w:before="80" w:after="120" w:line="276" w:lineRule="auto"/>
         <w:jc w:val="both"/>
       </w:pPr>
       <w:r>
@@ -3411,7 +2940,7 @@
     </w:p>
     <w:p>
       <w:pPr>
-        <w:spacing w:before="40" w:after="160" w:line="276" w:lineRule="auto"/>
+        <w:spacing w:before="80" w:after="120" w:line="276" w:lineRule="auto"/>
         <w:jc w:val="both"/>
       </w:pPr>
       <w:r>
@@ -3432,15 +2961,14 @@
           <w:color w:val="000000"/>
           <w:sz w:val="24"/>
         </w:rPr>
-        <w:t>A valid administrator reaches /admin, a valid donor reaches /dashboard, and an invalid or missing CSRF token is rejected with HTTP 400.</w:t>
+        <w:t>A valid administrator reaches /admin, a valid donor reaches /dashboard, and a missing CSRF token returns HTTP 400.</w:t>
       </w:r>
     </w:p>
     <w:p>
       <w:pPr>
-        <w:keepNext/>
         <w:pageBreakBefore/>
         <w:widowControl/>
-        <w:spacing w:before="240" w:after="140" w:line="240" w:lineRule="auto"/>
+        <w:spacing w:before="200" w:after="120" w:line="240" w:lineRule="auto"/>
         <w:jc w:val="left"/>
       </w:pPr>
       <w:r>
@@ -3497,8 +3025,6 @@
     </w:p>
     <w:p>
       <w:pPr>
-        <w:keepNext w:val="0"/>
-        <w:pageBreakBefore w:val="0"/>
         <w:widowControl/>
         <w:spacing w:before="0" w:after="160" w:line="240" w:lineRule="auto"/>
         <w:jc w:val="center"/>
@@ -3516,10 +3042,8 @@
     </w:p>
     <w:p>
       <w:pPr>
-        <w:keepNext w:val="0"/>
-        <w:pageBreakBefore w:val="0"/>
         <w:widowControl/>
-        <w:spacing w:before="0" w:after="200" w:line="276" w:lineRule="auto"/>
+        <w:spacing w:before="0" w:after="0" w:line="276" w:lineRule="auto"/>
         <w:jc w:val="both"/>
       </w:pPr>
       <w:r>
@@ -3530,12 +3054,12 @@
           <w:color w:val="000000"/>
           <w:sz w:val="24"/>
         </w:rPr>
-        <w:t>The landing page states the problem and gives visitors two immediate actions: search for availability or register as a donor. The board metaphor is established before any data is shown, and group-level stock totals are visible without signing in.</w:t>
+        <w:t>The landing page states the problem and gives visitors two immediate actions: search for availability or register as a donor. Group-level stock totals are visible without signing in.</w:t>
       </w:r>
     </w:p>
     <w:p>
       <w:pPr>
-        <w:spacing w:before="40" w:after="160" w:line="276" w:lineRule="auto"/>
+        <w:spacing w:before="80" w:after="120" w:line="276" w:lineRule="auto"/>
         <w:jc w:val="both"/>
       </w:pPr>
       <w:r>
@@ -3556,12 +3080,12 @@
           <w:color w:val="000000"/>
           <w:sz w:val="24"/>
         </w:rPr>
-        <w:t>public availability search, donor registration, live stock summary, low-stock signalling and a clear route to sign in.</w:t>
+        <w:t>public availability search, donor registration, live stock summary, low-stock signalling and a sign-in route.</w:t>
       </w:r>
     </w:p>
     <w:p>
       <w:pPr>
-        <w:spacing w:before="40" w:after="160" w:line="276" w:lineRule="auto"/>
+        <w:spacing w:before="80" w:after="120" w:line="276" w:lineRule="auto"/>
         <w:jc w:val="both"/>
       </w:pPr>
       <w:r>
@@ -3587,10 +3111,9 @@
     </w:p>
     <w:p>
       <w:pPr>
-        <w:keepNext/>
         <w:pageBreakBefore/>
         <w:widowControl/>
-        <w:spacing w:before="240" w:after="140" w:line="240" w:lineRule="auto"/>
+        <w:spacing w:before="200" w:after="120" w:line="240" w:lineRule="auto"/>
         <w:jc w:val="left"/>
       </w:pPr>
       <w:r>
@@ -3647,8 +3170,6 @@
     </w:p>
     <w:p>
       <w:pPr>
-        <w:keepNext w:val="0"/>
-        <w:pageBreakBefore w:val="0"/>
         <w:widowControl/>
         <w:spacing w:before="0" w:after="160" w:line="240" w:lineRule="auto"/>
         <w:jc w:val="center"/>
@@ -3666,10 +3187,8 @@
     </w:p>
     <w:p>
       <w:pPr>
-        <w:keepNext w:val="0"/>
-        <w:pageBreakBefore w:val="0"/>
         <w:widowControl/>
-        <w:spacing w:before="0" w:after="200" w:line="276" w:lineRule="auto"/>
+        <w:spacing w:before="0" w:after="0" w:line="276" w:lineRule="auto"/>
         <w:jc w:val="both"/>
       </w:pPr>
       <w:r>
@@ -3680,12 +3199,12 @@
           <w:color w:val="000000"/>
           <w:sz w:val="24"/>
         </w:rPr>
-        <w:t>The search page returns hospital rows for the selected blood group and city. Each row includes the hospital name, city, phone number and available units, so the visitor can act on the result immediately.</w:t>
+        <w:t>The search page returns hospital rows for the selected blood group and city. Each row includes the hospital name, city, phone number and available units.</w:t>
       </w:r>
     </w:p>
     <w:p>
       <w:pPr>
-        <w:spacing w:before="40" w:after="160" w:line="276" w:lineRule="auto"/>
+        <w:spacing w:before="80" w:after="120" w:line="276" w:lineRule="auto"/>
         <w:jc w:val="both"/>
       </w:pPr>
       <w:r>
@@ -3711,7 +3230,7 @@
     </w:p>
     <w:p>
       <w:pPr>
-        <w:spacing w:before="40" w:after="160" w:line="276" w:lineRule="auto"/>
+        <w:spacing w:before="80" w:after="120" w:line="276" w:lineRule="auto"/>
         <w:jc w:val="both"/>
       </w:pPr>
       <w:r>
@@ -3737,10 +3256,9 @@
     </w:p>
     <w:p>
       <w:pPr>
-        <w:keepNext/>
         <w:pageBreakBefore/>
         <w:widowControl/>
-        <w:spacing w:before="240" w:after="140" w:line="240" w:lineRule="auto"/>
+        <w:spacing w:before="200" w:after="120" w:line="240" w:lineRule="auto"/>
         <w:jc w:val="left"/>
       </w:pPr>
       <w:r>
@@ -3797,8 +3315,6 @@
     </w:p>
     <w:p>
       <w:pPr>
-        <w:keepNext w:val="0"/>
-        <w:pageBreakBefore w:val="0"/>
         <w:widowControl/>
         <w:spacing w:before="0" w:after="160" w:line="240" w:lineRule="auto"/>
         <w:jc w:val="center"/>
@@ -3816,10 +3332,8 @@
     </w:p>
     <w:p>
       <w:pPr>
-        <w:keepNext w:val="0"/>
-        <w:pageBreakBefore w:val="0"/>
         <w:widowControl/>
-        <w:spacing w:before="0" w:after="200" w:line="276" w:lineRule="auto"/>
+        <w:spacing w:before="0" w:after="0" w:line="276" w:lineRule="auto"/>
         <w:jc w:val="both"/>
       </w:pPr>
       <w:r>
@@ -3830,12 +3344,12 @@
           <w:color w:val="000000"/>
           <w:sz w:val="24"/>
         </w:rPr>
-        <w:t>The donor dashboard answers the questions a donor actually asks: when did I last donate, when can I donate again, what have I given, and what is happening to my request?</w:t>
+        <w:t>The donor dashboard answers the questions a donor actually asks: when did I last donate, when can I donate again, what have I given and what is happening to my request?</w:t>
       </w:r>
     </w:p>
     <w:p>
       <w:pPr>
-        <w:spacing w:before="40" w:after="160" w:line="276" w:lineRule="auto"/>
+        <w:spacing w:before="80" w:after="120" w:line="276" w:lineRule="auto"/>
         <w:jc w:val="both"/>
       </w:pPr>
       <w:r>
@@ -3861,7 +3375,7 @@
     </w:p>
     <w:p>
       <w:pPr>
-        <w:spacing w:before="40" w:after="160" w:line="276" w:lineRule="auto"/>
+        <w:spacing w:before="80" w:after="120" w:line="276" w:lineRule="auto"/>
         <w:jc w:val="both"/>
       </w:pPr>
       <w:r>
@@ -3887,10 +3401,9 @@
     </w:p>
     <w:p>
       <w:pPr>
-        <w:keepNext/>
         <w:pageBreakBefore/>
         <w:widowControl/>
-        <w:spacing w:before="240" w:after="140" w:line="240" w:lineRule="auto"/>
+        <w:spacing w:before="200" w:after="120" w:line="240" w:lineRule="auto"/>
         <w:jc w:val="left"/>
       </w:pPr>
       <w:r>
@@ -3947,8 +3460,6 @@
     </w:p>
     <w:p>
       <w:pPr>
-        <w:keepNext w:val="0"/>
-        <w:pageBreakBefore w:val="0"/>
         <w:widowControl/>
         <w:spacing w:before="0" w:after="160" w:line="240" w:lineRule="auto"/>
         <w:jc w:val="center"/>
@@ -3966,10 +3477,8 @@
     </w:p>
     <w:p>
       <w:pPr>
-        <w:keepNext w:val="0"/>
-        <w:pageBreakBefore w:val="0"/>
         <w:widowControl/>
-        <w:spacing w:before="0" w:after="200" w:line="276" w:lineRule="auto"/>
+        <w:spacing w:before="0" w:after="0" w:line="276" w:lineRule="auto"/>
         <w:jc w:val="both"/>
       </w:pPr>
       <w:r>
@@ -3980,12 +3489,12 @@
           <w:color w:val="000000"/>
           <w:sz w:val="24"/>
         </w:rPr>
-        <w:t>The administrator board is the first viewport after login. Group stock is arranged as split-flap strips, critical groups are marked in red, and pending requests appear as paper slips. The right column shows recent donations and hospital totals.</w:t>
+        <w:t>The administrator board is the first viewport after login. Group stock is arranged as split-flap strips, critical groups are marked in red, and pending requests appear as paper slips.</w:t>
       </w:r>
     </w:p>
     <w:p>
       <w:pPr>
-        <w:spacing w:before="40" w:after="160" w:line="276" w:lineRule="auto"/>
+        <w:spacing w:before="80" w:after="120" w:line="276" w:lineRule="auto"/>
         <w:jc w:val="both"/>
       </w:pPr>
       <w:r>
@@ -4011,7 +3520,7 @@
     </w:p>
     <w:p>
       <w:pPr>
-        <w:spacing w:before="40" w:after="160" w:line="276" w:lineRule="auto"/>
+        <w:spacing w:before="80" w:after="120" w:line="276" w:lineRule="auto"/>
         <w:jc w:val="both"/>
       </w:pPr>
       <w:r>
@@ -4037,10 +3546,9 @@
     </w:p>
     <w:p>
       <w:pPr>
-        <w:keepNext/>
         <w:pageBreakBefore/>
         <w:widowControl/>
-        <w:spacing w:before="240" w:after="140" w:line="240" w:lineRule="auto"/>
+        <w:spacing w:before="200" w:after="120" w:line="240" w:lineRule="auto"/>
         <w:jc w:val="left"/>
       </w:pPr>
       <w:r>
@@ -4097,8 +3605,6 @@
     </w:p>
     <w:p>
       <w:pPr>
-        <w:keepNext w:val="0"/>
-        <w:pageBreakBefore w:val="0"/>
         <w:widowControl/>
         <w:spacing w:before="0" w:after="160" w:line="240" w:lineRule="auto"/>
         <w:jc w:val="center"/>
@@ -4116,10 +3622,8 @@
     </w:p>
     <w:p>
       <w:pPr>
-        <w:keepNext w:val="0"/>
-        <w:pageBreakBefore w:val="0"/>
         <w:widowControl/>
-        <w:spacing w:before="0" w:after="200" w:line="276" w:lineRule="auto"/>
+        <w:spacing w:before="0" w:after="0" w:line="276" w:lineRule="auto"/>
         <w:jc w:val="both"/>
       </w:pPr>
       <w:r>
@@ -4135,7 +3639,7 @@
     </w:p>
     <w:p>
       <w:pPr>
-        <w:spacing w:before="40" w:after="160" w:line="276" w:lineRule="auto"/>
+        <w:spacing w:before="80" w:after="120" w:line="276" w:lineRule="auto"/>
         <w:jc w:val="both"/>
       </w:pPr>
       <w:r>
@@ -4161,7 +3665,7 @@
     </w:p>
     <w:p>
       <w:pPr>
-        <w:spacing w:before="40" w:after="160" w:line="276" w:lineRule="auto"/>
+        <w:spacing w:before="80" w:after="120" w:line="276" w:lineRule="auto"/>
         <w:jc w:val="both"/>
       </w:pPr>
       <w:r>
@@ -4187,10 +3691,9 @@
     </w:p>
     <w:p>
       <w:pPr>
-        <w:keepNext/>
         <w:pageBreakBefore/>
         <w:widowControl/>
-        <w:spacing w:before="240" w:after="140" w:line="240" w:lineRule="auto"/>
+        <w:spacing w:before="200" w:after="120" w:line="240" w:lineRule="auto"/>
         <w:jc w:val="left"/>
       </w:pPr>
       <w:r>
@@ -4247,8 +3750,6 @@
     </w:p>
     <w:p>
       <w:pPr>
-        <w:keepNext w:val="0"/>
-        <w:pageBreakBefore w:val="0"/>
         <w:widowControl/>
         <w:spacing w:before="0" w:after="160" w:line="240" w:lineRule="auto"/>
         <w:jc w:val="center"/>
@@ -4266,10 +3767,8 @@
     </w:p>
     <w:p>
       <w:pPr>
-        <w:keepNext w:val="0"/>
-        <w:pageBreakBefore w:val="0"/>
         <w:widowControl/>
-        <w:spacing w:before="0" w:after="200" w:line="276" w:lineRule="auto"/>
+        <w:spacing w:before="0" w:after="0" w:line="276" w:lineRule="auto"/>
         <w:jc w:val="both"/>
       </w:pPr>
       <w:r>
@@ -4285,7 +3784,7 @@
     </w:p>
     <w:p>
       <w:pPr>
-        <w:spacing w:before="40" w:after="160" w:line="276" w:lineRule="auto"/>
+        <w:spacing w:before="80" w:after="120" w:line="276" w:lineRule="auto"/>
         <w:jc w:val="both"/>
       </w:pPr>
       <w:r>
@@ -4311,7 +3810,7 @@
     </w:p>
     <w:p>
       <w:pPr>
-        <w:spacing w:before="40" w:after="160" w:line="276" w:lineRule="auto"/>
+        <w:spacing w:before="80" w:after="120" w:line="276" w:lineRule="auto"/>
         <w:jc w:val="both"/>
       </w:pPr>
       <w:r>
@@ -4337,10 +3836,9 @@
     </w:p>
     <w:p>
       <w:pPr>
-        <w:keepNext/>
         <w:pageBreakBefore/>
         <w:widowControl/>
-        <w:spacing w:before="240" w:after="140" w:line="240" w:lineRule="auto"/>
+        <w:spacing w:before="200" w:after="120" w:line="240" w:lineRule="auto"/>
         <w:jc w:val="left"/>
       </w:pPr>
       <w:r>
@@ -4356,10 +3854,8 @@
     </w:p>
     <w:p>
       <w:pPr>
-        <w:keepNext w:val="0"/>
-        <w:pageBreakBefore w:val="0"/>
         <w:widowControl/>
-        <w:spacing w:before="0" w:after="200" w:line="276" w:lineRule="auto"/>
+        <w:spacing w:before="0" w:after="0" w:line="276" w:lineRule="auto"/>
         <w:jc w:val="both"/>
       </w:pPr>
       <w:r>
@@ -4376,7 +3872,7 @@
     <w:p>
       <w:pPr>
         <w:pStyle w:val="ListBullet"/>
-        <w:spacing w:before="0" w:after="100" w:line="276" w:lineRule="auto"/>
+        <w:spacing w:before="0" w:after="0" w:line="276" w:lineRule="auto"/>
         <w:ind w:left="432" w:hanging="259"/>
         <w:jc w:val="left"/>
       </w:pPr>
@@ -4394,7 +3890,7 @@
     <w:p>
       <w:pPr>
         <w:pStyle w:val="ListBullet"/>
-        <w:spacing w:before="0" w:after="100" w:line="276" w:lineRule="auto"/>
+        <w:spacing w:before="0" w:after="0" w:line="276" w:lineRule="auto"/>
         <w:ind w:left="432" w:hanging="259"/>
         <w:jc w:val="left"/>
       </w:pPr>
@@ -4412,7 +3908,7 @@
     <w:p>
       <w:pPr>
         <w:pStyle w:val="ListBullet"/>
-        <w:spacing w:before="0" w:after="100" w:line="276" w:lineRule="auto"/>
+        <w:spacing w:before="0" w:after="0" w:line="276" w:lineRule="auto"/>
         <w:ind w:left="432" w:hanging="259"/>
         <w:jc w:val="left"/>
       </w:pPr>
@@ -4430,7 +3926,7 @@
     <w:p>
       <w:pPr>
         <w:pStyle w:val="ListBullet"/>
-        <w:spacing w:before="0" w:after="100" w:line="276" w:lineRule="auto"/>
+        <w:spacing w:before="0" w:after="0" w:line="276" w:lineRule="auto"/>
         <w:ind w:left="432" w:hanging="259"/>
         <w:jc w:val="left"/>
       </w:pPr>
@@ -4442,15 +3938,13 @@
           <w:color w:val="000000"/>
           <w:sz w:val="24"/>
         </w:rPr>
-        <w:t>Stock changed only after a valid completion, and the database row count changed only after a successful request or appointment insert.</w:t>
+        <w:t>Stock changed only after a valid completion, and database row counts changed only after a successful request or appointment insert.</w:t>
       </w:r>
     </w:p>
     <w:p>
       <w:pPr>
-        <w:keepNext w:val="0"/>
-        <w:pageBreakBefore w:val="0"/>
         <w:widowControl/>
-        <w:spacing w:before="0" w:after="200" w:line="276" w:lineRule="auto"/>
+        <w:spacing w:before="0" w:after="0" w:line="276" w:lineRule="auto"/>
         <w:jc w:val="both"/>
       </w:pPr>
       <w:r>
@@ -4465,9 +3959,17 @@
       </w:r>
     </w:p>
     <w:p>
-      <w:pPr>
-        <w:keepNext/>
-        <w:pageBreakBefore/>
+      <w:r>
+        <w:br w:type="page"/>
+      </w:r>
+    </w:p>
+    <w:p>
+      <w:pPr>
+        <w:spacing w:before="0" w:after="200" w:line="240" w:lineRule="auto"/>
+      </w:pPr>
+    </w:p>
+    <w:p>
+      <w:pPr>
         <w:widowControl/>
         <w:spacing w:before="0" w:after="0" w:line="240" w:lineRule="auto"/>
         <w:jc w:val="center"/>
@@ -4485,10 +3987,8 @@
     </w:p>
     <w:p>
       <w:pPr>
-        <w:keepNext/>
-        <w:pageBreakBefore w:val="0"/>
         <w:widowControl/>
-        <w:spacing w:before="0" w:after="360" w:line="240" w:lineRule="auto"/>
+        <w:spacing w:before="0" w:after="320" w:line="240" w:lineRule="auto"/>
         <w:jc w:val="center"/>
       </w:pPr>
       <w:r>
@@ -4504,10 +4004,8 @@
     </w:p>
     <w:p>
       <w:pPr>
-        <w:keepNext w:val="0"/>
-        <w:pageBreakBefore w:val="0"/>
         <w:widowControl/>
-        <w:spacing w:before="0" w:after="200" w:line="276" w:lineRule="auto"/>
+        <w:spacing w:before="0" w:after="0" w:line="276" w:lineRule="auto"/>
         <w:jc w:val="both"/>
       </w:pPr>
       <w:r>
@@ -4518,15 +4016,13 @@
           <w:color w:val="000000"/>
           <w:sz w:val="24"/>
         </w:rPr>
-        <w:t>The Online Blood Bank and Donor Management System demonstrates how a relational database can support a time-sensitive healthcare workflow. The six-table schema captures users, hospitals, inventory, requests, donations and appointments with explicit primary keys, foreign keys, uniqueness rules and check constraints. The application gives each role a focused surface: donors can find blood, check eligibility and manage their contribution history; administrators can see the shelf, clear the request rail and record donations.</w:t>
+        <w:t>The Online Blood Bank and Donor Management System demonstrates how a relational database can support a time-sensitive healthcare workflow. The six-table schema captures users, hospitals, inventory, requests, donations and appointments through explicit primary keys, foreign keys, uniqueness rules and check constraints. Each role receives a focused surface: donors find blood, check eligibility and manage their contribution history; administrators see the shelf, clear the request rail and record donations.</w:t>
       </w:r>
     </w:p>
     <w:p>
       <w:pPr>
-        <w:keepNext w:val="0"/>
-        <w:pageBreakBefore w:val="0"/>
         <w:widowControl/>
-        <w:spacing w:before="0" w:after="200" w:line="276" w:lineRule="auto"/>
+        <w:spacing w:before="0" w:after="0" w:line="276" w:lineRule="auto"/>
         <w:jc w:val="both"/>
       </w:pPr>
       <w:r>
@@ -4537,15 +4033,13 @@
           <w:color w:val="000000"/>
           <w:sz w:val="24"/>
         </w:rPr>
-        <w:t>From a DBMS perspective, the project applies relational schema design, normalisation, foreign-key integrity, unique and check constraints, indexes and multi-table joins. The application uses parameterized SQL throughout, commits each write, and performs stock validation before deducting units. Authentication, role guards and CSRF protection show that database quality must be paired with application-level security; a correct schema alone does not prevent an unauthorised action.</w:t>
+        <w:t>From a DBMS perspective, the project applies relational schema design, normalisation, foreign-key integrity, unique and check constraints, indexes and parameterized SQL. The application commits each write, performs stock validation before deducting units, and enforces every write through server-side validation. Authentication, role guards and CSRF protection show that database quality must be paired with application-level security; a correct schema alone does not prevent an unauthorised action.</w:t>
       </w:r>
     </w:p>
     <w:p>
       <w:pPr>
-        <w:keepNext w:val="0"/>
-        <w:pageBreakBefore w:val="0"/>
         <w:widowControl/>
-        <w:spacing w:before="0" w:after="200" w:line="276" w:lineRule="auto"/>
+        <w:spacing w:before="0" w:after="0" w:line="276" w:lineRule="auto"/>
         <w:jc w:val="both"/>
       </w:pPr>
       <w:r>
@@ -4556,15 +4050,13 @@
           <w:color w:val="000000"/>
           <w:sz w:val="24"/>
         </w:rPr>
-        <w:t>The interface contributes to the result. A conventional dashboard would display the same data, but the dispatch-board language gives the administrator a mental model that matches the work: stock is a strip, a request is a slip, approval is a stamp and completion is a deduction. The mobile layout keeps the same actions available on a phone, and the reduced-motion path keeps the content usable without animation.</w:t>
+        <w:t>The interface contributes to the result because it exposes the same relational facts that the schema encodes. Stock appears as ordered units rather than free text, requests move through an explicit state machine rather than undefined statuses, and terminal rows are retained as filed records. The mobile layout keeps the same actions available on a phone, and the reduced-motion path keeps the content usable without animation.</w:t>
       </w:r>
     </w:p>
     <w:p>
       <w:pPr>
-        <w:keepNext w:val="0"/>
-        <w:pageBreakBefore w:val="0"/>
         <w:widowControl/>
-        <w:spacing w:before="0" w:after="200" w:line="276" w:lineRule="auto"/>
+        <w:spacing w:before="0" w:after="0" w:line="276" w:lineRule="auto"/>
         <w:jc w:val="both"/>
       </w:pPr>
       <w:r>
@@ -4575,15 +4067,13 @@
           <w:color w:val="000000"/>
           <w:sz w:val="24"/>
         </w:rPr>
-        <w:t>The prototype has clear limits. It uses SQLite, which is suitable for a single-node demonstration but not for concurrent multi-branch operation. It does not verify clinical compatibility, screen donated blood, confirm donor identity or replace hospital procedures. It also lacks email notifications, audit logging, rate limiting and production backup. Future work can migrate the schema to MySQL or PostgreSQL, add versioned migrations, audit trails, notifications, pagination and a CI test pipeline.</w:t>
+        <w:t>The prototype has clear limits. It uses SQLite, which is adequate for a single-node demonstration but not for concurrent multi-branch operation. It does not verify clinical compatibility, screen donated blood, confirm donor identity or replace hospital procedures. It also lacks email notifications, audit logging, rate limiting and production backup. Future work can migrate the schema to MySQL or PostgreSQL, add versioned migrations, audit trails, notifications, pagination and an automated CI test pipeline.</w:t>
       </w:r>
     </w:p>
     <w:p>
       <w:pPr>
-        <w:keepNext w:val="0"/>
-        <w:pageBreakBefore w:val="0"/>
         <w:widowControl/>
-        <w:spacing w:before="0" w:after="200" w:line="276" w:lineRule="auto"/>
+        <w:spacing w:before="0" w:after="0" w:line="276" w:lineRule="auto"/>
         <w:jc w:val="both"/>
       </w:pPr>
       <w:r>
@@ -4594,13 +4084,13 @@
           <w:color w:val="000000"/>
           <w:sz w:val="24"/>
         </w:rPr>
-        <w:t>Overall, the project meets its academic objective: it turns a database exercise into a coherent, working application and shows how schema constraints, server-side validation, role-based access and interface craft combine to produce trustworthy behaviour. With the migration and operational work described above, the same structure could serve as the foundation for a larger blood-bank information system.</w:t>
+        <w:t>Overall, the project meets its academic objective: it turns a database exercise into a coherent working application and shows how schema constraints, server-side validation, role-based access and interface craft combine to produce trustworthy behaviour. With the migration and operational work described above, the same structure could serve as the foundation for a larger blood-bank information system.</w:t>
       </w:r>
     </w:p>
     <w:sectPr>
       <w:footerReference w:type="default" r:id="rId10"/>
       <w:pgSz w:w="12240" w:h="15840"/>
-      <w:pgMar w:top="720" w:right="1440" w:bottom="720" w:left="1440" w:header="360" w:footer="403" w:gutter="0"/>
+      <w:pgMar w:top="720" w:right="1440" w:bottom="720" w:left="1440" w:header="360" w:footer="360" w:gutter="0"/>
       <w:cols w:space="720"/>
       <w:docGrid w:linePitch="360"/>
       <w:pgNumType w:start="1"/>

</xml_diff>